<commit_message>
update NT scan form
Co-Authored-By: Claude Opus 5.5 <noreply@anthropic.com>
</commit_message>
<xml_diff>
--- a/templates/nt_scan.docx
+++ b/templates/nt_scan.docx
@@ -1,6 +1,6 @@
 
 <file path=word/document.xml><?xml version="1.0" encoding="utf-8"?>
-<w:document xmlns:wpc="http://schemas.microsoft.com/office/word/2010/wordprocessingCanvas" xmlns:mc="http://schemas.openxmlformats.org/markup-compatibility/2006" xmlns:o="urn:schemas-microsoft-com:office:office" xmlns:r="http://schemas.openxmlformats.org/officeDocument/2006/relationships" xmlns:m="http://schemas.openxmlformats.org/officeDocument/2006/math" xmlns:v="urn:schemas-microsoft-com:vml" xmlns:wp14="http://schemas.microsoft.com/office/word/2010/wordprocessingDrawing" xmlns:wp="http://schemas.openxmlformats.org/drawingml/2006/wordprocessingDrawing" xmlns:w10="urn:schemas-microsoft-com:office:word" xmlns:w="http://schemas.openxmlformats.org/wordprocessingml/2006/main" xmlns:w14="http://schemas.microsoft.com/office/word/2010/wordml" xmlns:w15="http://schemas.microsoft.com/office/word/2012/wordml" xmlns:wpg="http://schemas.microsoft.com/office/word/2010/wordprocessingGroup" xmlns:wpi="http://schemas.microsoft.com/office/word/2010/wordprocessingInk" xmlns:wne="http://schemas.microsoft.com/office/word/2006/wordml" xmlns:wps="http://schemas.microsoft.com/office/word/2010/wordprocessingShape" mc:Ignorable="w14 w15 wp14">
+<w:document xmlns:wpc="http://schemas.microsoft.com/office/word/2010/wordprocessingCanvas" xmlns:cx="http://schemas.microsoft.com/office/drawing/2014/chartex" xmlns:cx1="http://schemas.microsoft.com/office/drawing/2015/9/8/chartex" xmlns:cx2="http://schemas.microsoft.com/office/drawing/2015/10/21/chartex" xmlns:cx3="http://schemas.microsoft.com/office/drawing/2016/5/9/chartex" xmlns:cx4="http://schemas.microsoft.com/office/drawing/2016/5/10/chartex" xmlns:cx5="http://schemas.microsoft.com/office/drawing/2016/5/11/chartex" xmlns:cx6="http://schemas.microsoft.com/office/drawing/2016/5/12/chartex" xmlns:cx7="http://schemas.microsoft.com/office/drawing/2016/5/13/chartex" xmlns:cx8="http://schemas.microsoft.com/office/drawing/2016/5/14/chartex" xmlns:mc="http://schemas.openxmlformats.org/markup-compatibility/2006" xmlns:aink="http://schemas.microsoft.com/office/drawing/2016/ink" xmlns:am3d="http://schemas.microsoft.com/office/drawing/2017/model3d" xmlns:o="urn:schemas-microsoft-com:office:office" xmlns:oel="http://schemas.microsoft.com/office/2019/extlst" xmlns:r="http://schemas.openxmlformats.org/officeDocument/2006/relationships" xmlns:m="http://schemas.openxmlformats.org/officeDocument/2006/math" xmlns:v="urn:schemas-microsoft-com:vml" xmlns:wp14="http://schemas.microsoft.com/office/word/2010/wordprocessingDrawing" xmlns:wp="http://schemas.openxmlformats.org/drawingml/2006/wordprocessingDrawing" xmlns:w10="urn:schemas-microsoft-com:office:word" xmlns:w="http://schemas.openxmlformats.org/wordprocessingml/2006/main" xmlns:w14="http://schemas.microsoft.com/office/word/2010/wordml" xmlns:w15="http://schemas.microsoft.com/office/word/2012/wordml" xmlns:w16cex="http://schemas.microsoft.com/office/word/2018/wordml/cex" xmlns:w16cid="http://schemas.microsoft.com/office/word/2016/wordml/cid" xmlns:w16="http://schemas.microsoft.com/office/word/2018/wordml" xmlns:w16du="http://schemas.microsoft.com/office/word/2023/wordml/word16du" xmlns:w16sdtdh="http://schemas.microsoft.com/office/word/2020/wordml/sdtdatahash" xmlns:w16sdtfl="http://schemas.microsoft.com/office/word/2024/wordml/sdtformatlock" xmlns:w16se="http://schemas.microsoft.com/office/word/2015/wordml/symex" xmlns:wpg="http://schemas.microsoft.com/office/word/2010/wordprocessingGroup" xmlns:wpi="http://schemas.microsoft.com/office/word/2010/wordprocessingInk" xmlns:wne="http://schemas.microsoft.com/office/word/2006/wordml" xmlns:wps="http://schemas.microsoft.com/office/word/2010/wordprocessingShape" mc:Ignorable="w14 w15 w16se w16cid w16 w16cex w16sdtdh w16sdtfl w16du wp14">
   <w:body>
     <w:p/>
     <w:p>
@@ -691,13 +691,7 @@
               <w:rPr>
                 <w:b/>
               </w:rPr>
-              <w:t xml:space="preserve">Nuchal </w:t>
-            </w:r>
-            <w:r>
-              <w:rPr>
-                <w:b/>
-              </w:rPr>
-              <w:t>translucency</w:t>
+              <w:t>Nuchal translucency</w:t>
             </w:r>
           </w:p>
         </w:tc>
@@ -829,8 +823,6 @@
         </w:rPr>
         <w:t xml:space="preserve">CLINICAL </w:t>
       </w:r>
-      <w:bookmarkStart w:id="0" w:name="_GoBack"/>
-      <w:bookmarkEnd w:id="0"/>
       <w:r>
         <w:rPr>
           <w:b/>
@@ -1298,23 +1290,32 @@
     <w:p>
       <w:pPr>
         <w:spacing w:before="80"/>
+        <w:rPr>
+          <w:b/>
+        </w:rPr>
       </w:pPr>
       <w:r>
         <w:rPr>
           <w:b/>
         </w:rPr>
-        <w:t xml:space="preserve">Adv: </w:t>
-      </w:r>
-      <w:r>
-        <w:rPr>
-          <w:b/>
-        </w:rPr>
-        <w:t>Anomaly scan at 20 weeks.</w:t>
+        <w:t>Adv: Anomaly scan at 20 weeks.</w:t>
       </w:r>
     </w:p>
     <w:p>
       <w:pPr>
-        <w:spacing w:before="160"/>
+        <w:spacing w:before="80"/>
+        <w:rPr>
+          <w:b/>
+        </w:rPr>
+      </w:pPr>
+    </w:p>
+    <w:p>
+      <w:pPr>
+        <w:spacing w:before="80"/>
+        <w:rPr>
+          <w:b/>
+          <w:sz w:val="22"/>
+        </w:rPr>
       </w:pPr>
       <w:r>
         <w:rPr>
@@ -1323,63 +1324,208 @@
         </w:rPr>
         <w:t>Note:</w:t>
       </w:r>
-      <w:r>
-        <w:br/>
-      </w:r>
+    </w:p>
+    <w:p>
+      <w:pPr>
+        <w:pStyle w:val="ListParagraph"/>
+        <w:numPr>
+          <w:ilvl w:val="0"/>
+          <w:numId w:val="11"/>
+        </w:numPr>
+        <w:spacing w:before="80"/>
+      </w:pPr>
       <w:r>
         <w:rPr>
-          <w:sz w:val="22"/>
+          <w:i/>
+          <w:iCs/>
+          <w:szCs w:val="28"/>
         </w:rPr>
-        <w:t>Foetal heart, spine, face and kidneys cannot be well assessed at this stage of pregnancy. These regions can be assessed in the 20 to 24 weeks scan.</w:t>
+        <w:t>Down’s syndrome can’t be diagnosed on the base of USG alone.</w:t>
       </w:r>
-      <w:r>
-        <w:br/>
-      </w:r>
+    </w:p>
+    <w:p>
+      <w:pPr>
+        <w:pStyle w:val="ListParagraph"/>
+        <w:numPr>
+          <w:ilvl w:val="0"/>
+          <w:numId w:val="11"/>
+        </w:numPr>
+        <w:spacing w:after="0"/>
+        <w:rPr>
+          <w:i/>
+          <w:iCs/>
+          <w:szCs w:val="28"/>
+        </w:rPr>
+      </w:pPr>
       <w:r>
         <w:rPr>
-          <w:sz w:val="22"/>
+          <w:i/>
+          <w:iCs/>
+          <w:szCs w:val="28"/>
         </w:rPr>
-        <w:t>Down's syndrome can't be diagnosed on the basis of USG alone. The risk ratio</w:t>
+        <w:t>The risk ratio indicates risk rates it’s not definitive testing.</w:t>
       </w:r>
+    </w:p>
+    <w:p>
+      <w:pPr>
+        <w:pStyle w:val="ListParagraph"/>
+        <w:numPr>
+          <w:ilvl w:val="0"/>
+          <w:numId w:val="11"/>
+        </w:numPr>
+        <w:spacing w:after="0"/>
+        <w:rPr>
+          <w:i/>
+          <w:iCs/>
+          <w:szCs w:val="28"/>
+        </w:rPr>
+      </w:pPr>
       <w:r>
         <w:rPr>
-          <w:sz w:val="22"/>
+          <w:i/>
+          <w:iCs/>
+          <w:szCs w:val="28"/>
         </w:rPr>
-        <w:t xml:space="preserve"> indicates risk rates; it is not definitive testing.</w:t>
+        <w:t xml:space="preserve">The detection of downs syndrome by </w:t>
       </w:r>
-      <w:r>
-        <w:br/>
-      </w:r>
+    </w:p>
+    <w:p>
+      <w:pPr>
+        <w:pStyle w:val="ListParagraph"/>
+        <w:numPr>
+          <w:ilvl w:val="1"/>
+          <w:numId w:val="10"/>
+        </w:numPr>
+        <w:spacing w:after="0"/>
+        <w:rPr>
+          <w:i/>
+          <w:iCs/>
+          <w:szCs w:val="28"/>
+        </w:rPr>
+      </w:pPr>
       <w:r>
         <w:rPr>
-          <w:sz w:val="22"/>
+          <w:i/>
+          <w:iCs/>
+          <w:szCs w:val="28"/>
         </w:rPr>
-        <w:t>Detection of Down's syndrome by: first trimester NT only - 64 to 70%; first trimester combined (NT + maternal blood test) - 80 to 85%; sequential screening (combined quadruple 15-19 weeks + genetic sonog</w:t>
+        <w:t>First trimester NT only – 64 to 70%.</w:t>
       </w:r>
+    </w:p>
+    <w:p>
+      <w:pPr>
+        <w:pStyle w:val="ListParagraph"/>
+        <w:numPr>
+          <w:ilvl w:val="1"/>
+          <w:numId w:val="10"/>
+        </w:numPr>
+        <w:spacing w:after="0"/>
+        <w:rPr>
+          <w:i/>
+          <w:iCs/>
+          <w:szCs w:val="28"/>
+        </w:rPr>
+      </w:pPr>
       <w:r>
         <w:rPr>
-          <w:sz w:val="22"/>
+          <w:i/>
+          <w:iCs/>
+          <w:szCs w:val="28"/>
         </w:rPr>
-        <w:t>ram at 18-20 weeks) - 95%; maternal blood test for cell free foetal DNA - 99%.</w:t>
+        <w:t>First trimester combined (NT + maternal blood test) 80-85%.</w:t>
       </w:r>
-      <w:r>
-        <w:br/>
-      </w:r>
+    </w:p>
+    <w:p>
+      <w:pPr>
+        <w:pStyle w:val="ListParagraph"/>
+        <w:numPr>
+          <w:ilvl w:val="1"/>
+          <w:numId w:val="10"/>
+        </w:numPr>
+        <w:spacing w:after="0"/>
+        <w:rPr>
+          <w:i/>
+          <w:iCs/>
+          <w:szCs w:val="28"/>
+        </w:rPr>
+      </w:pPr>
       <w:r>
         <w:rPr>
-          <w:sz w:val="22"/>
+          <w:i/>
+          <w:iCs/>
+          <w:szCs w:val="28"/>
         </w:rPr>
-        <w:t>Invasive testing (CVS/amniocentesis), which is a definitive test, has a procedure related risk of about 1:200.</w:t>
+        <w:t>Sequential screening (combined quadruple 15-19weeks + genetic sonogram at 18-20weeks) 95%.</w:t>
       </w:r>
-      <w:r>
-        <w:br/>
-      </w:r>
+    </w:p>
+    <w:p>
+      <w:pPr>
+        <w:pStyle w:val="ListParagraph"/>
+        <w:numPr>
+          <w:ilvl w:val="1"/>
+          <w:numId w:val="10"/>
+        </w:numPr>
+        <w:spacing w:after="0"/>
+        <w:rPr>
+          <w:i/>
+          <w:iCs/>
+          <w:szCs w:val="28"/>
+        </w:rPr>
+      </w:pPr>
       <w:r>
         <w:rPr>
-          <w:sz w:val="22"/>
+          <w:i/>
+          <w:iCs/>
+          <w:szCs w:val="28"/>
         </w:rPr>
-        <w:t>This has been explained to the patient and attendant.</w:t>
+        <w:t>Maternal blood test for cell free foetal DNA 99%.</w:t>
       </w:r>
+    </w:p>
+    <w:p>
+      <w:pPr>
+        <w:pStyle w:val="ListParagraph"/>
+        <w:numPr>
+          <w:ilvl w:val="1"/>
+          <w:numId w:val="10"/>
+        </w:numPr>
+        <w:spacing w:after="0"/>
+        <w:rPr>
+          <w:i/>
+          <w:iCs/>
+          <w:szCs w:val="28"/>
+        </w:rPr>
+      </w:pPr>
+      <w:r>
+        <w:rPr>
+          <w:i/>
+          <w:iCs/>
+          <w:szCs w:val="28"/>
+        </w:rPr>
+        <w:t>Invasive testing (CVS/amniocentesis) which if defensive test has a procedure related risk of about 1:200.</w:t>
+      </w:r>
+    </w:p>
+    <w:p>
+      <w:pPr>
+        <w:spacing w:after="0"/>
+        <w:rPr>
+          <w:i/>
+          <w:iCs/>
+          <w:szCs w:val="28"/>
+        </w:rPr>
+      </w:pPr>
+      <w:r>
+        <w:rPr>
+          <w:i/>
+          <w:iCs/>
+          <w:szCs w:val="28"/>
+        </w:rPr>
+        <w:t xml:space="preserve">This has been explained to the patient and attendant.  </w:t>
+      </w:r>
+    </w:p>
+    <w:p>
+      <w:pPr>
+        <w:spacing w:before="160"/>
+      </w:pPr>
     </w:p>
     <w:p>
       <w:pPr>
@@ -1391,14 +1537,8 @@
           <w:b/>
           <w:sz w:val="22"/>
         </w:rPr>
-        <w:t xml:space="preserve">DECLARATION </w:t>
-      </w:r>
-      <w:r>
-        <w:rPr>
-          <w:b/>
-          <w:sz w:val="22"/>
-        </w:rPr>
-        <w:t>OF DOCTOR/PERSON CONDUCTING ULTRASONOGRAPHY / IMAGE SCANNING</w:t>
+        <w:lastRenderedPageBreak/>
+        <w:t>DECLARATION OF DOCTOR/PERSON CONDUCTING ULTRASONOGRAPHY / IMAGE SCANNING</w:t>
       </w:r>
     </w:p>
     <w:p>
@@ -1446,7 +1586,7 @@
 </file>
 
 <file path=word/endnotes.xml><?xml version="1.0" encoding="utf-8"?>
-<w:endnotes xmlns:wpc="http://schemas.microsoft.com/office/word/2010/wordprocessingCanvas" xmlns:mc="http://schemas.openxmlformats.org/markup-compatibility/2006" xmlns:o="urn:schemas-microsoft-com:office:office" xmlns:r="http://schemas.openxmlformats.org/officeDocument/2006/relationships" xmlns:m="http://schemas.openxmlformats.org/officeDocument/2006/math" xmlns:v="urn:schemas-microsoft-com:vml" xmlns:wp14="http://schemas.microsoft.com/office/word/2010/wordprocessingDrawing" xmlns:wp="http://schemas.openxmlformats.org/drawingml/2006/wordprocessingDrawing" xmlns:w10="urn:schemas-microsoft-com:office:word" xmlns:w="http://schemas.openxmlformats.org/wordprocessingml/2006/main" xmlns:w14="http://schemas.microsoft.com/office/word/2010/wordml" xmlns:w15="http://schemas.microsoft.com/office/word/2012/wordml" xmlns:wpg="http://schemas.microsoft.com/office/word/2010/wordprocessingGroup" xmlns:wpi="http://schemas.microsoft.com/office/word/2010/wordprocessingInk" xmlns:wne="http://schemas.microsoft.com/office/word/2006/wordml" xmlns:wps="http://schemas.microsoft.com/office/word/2010/wordprocessingShape" mc:Ignorable="w14 w15 wp14">
+<w:endnotes xmlns:wpc="http://schemas.microsoft.com/office/word/2010/wordprocessingCanvas" xmlns:cx="http://schemas.microsoft.com/office/drawing/2014/chartex" xmlns:cx1="http://schemas.microsoft.com/office/drawing/2015/9/8/chartex" xmlns:cx2="http://schemas.microsoft.com/office/drawing/2015/10/21/chartex" xmlns:cx3="http://schemas.microsoft.com/office/drawing/2016/5/9/chartex" xmlns:cx4="http://schemas.microsoft.com/office/drawing/2016/5/10/chartex" xmlns:cx5="http://schemas.microsoft.com/office/drawing/2016/5/11/chartex" xmlns:cx6="http://schemas.microsoft.com/office/drawing/2016/5/12/chartex" xmlns:cx7="http://schemas.microsoft.com/office/drawing/2016/5/13/chartex" xmlns:cx8="http://schemas.microsoft.com/office/drawing/2016/5/14/chartex" xmlns:mc="http://schemas.openxmlformats.org/markup-compatibility/2006" xmlns:aink="http://schemas.microsoft.com/office/drawing/2016/ink" xmlns:am3d="http://schemas.microsoft.com/office/drawing/2017/model3d" xmlns:o="urn:schemas-microsoft-com:office:office" xmlns:oel="http://schemas.microsoft.com/office/2019/extlst" xmlns:r="http://schemas.openxmlformats.org/officeDocument/2006/relationships" xmlns:m="http://schemas.openxmlformats.org/officeDocument/2006/math" xmlns:v="urn:schemas-microsoft-com:vml" xmlns:wp14="http://schemas.microsoft.com/office/word/2010/wordprocessingDrawing" xmlns:wp="http://schemas.openxmlformats.org/drawingml/2006/wordprocessingDrawing" xmlns:w10="urn:schemas-microsoft-com:office:word" xmlns:w="http://schemas.openxmlformats.org/wordprocessingml/2006/main" xmlns:w14="http://schemas.microsoft.com/office/word/2010/wordml" xmlns:w15="http://schemas.microsoft.com/office/word/2012/wordml" xmlns:w16cex="http://schemas.microsoft.com/office/word/2018/wordml/cex" xmlns:w16cid="http://schemas.microsoft.com/office/word/2016/wordml/cid" xmlns:w16="http://schemas.microsoft.com/office/word/2018/wordml" xmlns:w16du="http://schemas.microsoft.com/office/word/2023/wordml/word16du" xmlns:w16sdtdh="http://schemas.microsoft.com/office/word/2020/wordml/sdtdatahash" xmlns:w16sdtfl="http://schemas.microsoft.com/office/word/2024/wordml/sdtformatlock" xmlns:w16se="http://schemas.microsoft.com/office/word/2015/wordml/symex" xmlns:wpg="http://schemas.microsoft.com/office/word/2010/wordprocessingGroup" xmlns:wpi="http://schemas.microsoft.com/office/word/2010/wordprocessingInk" xmlns:wne="http://schemas.microsoft.com/office/word/2006/wordml" xmlns:wps="http://schemas.microsoft.com/office/word/2010/wordprocessingShape" mc:Ignorable="w14 w15 w16se w16cid w16 w16cex w16sdtdh w16sdtfl w16du wp14">
   <w:endnote w:type="separator" w:id="-1">
     <w:p>
       <w:pPr>
@@ -1471,14 +1611,27 @@
 </file>
 
 <file path=word/footer1.xml><?xml version="1.0" encoding="utf-8"?>
-<w:ftr xmlns:wpc="http://schemas.microsoft.com/office/word/2010/wordprocessingCanvas" xmlns:mc="http://schemas.openxmlformats.org/markup-compatibility/2006" xmlns:o="urn:schemas-microsoft-com:office:office" xmlns:r="http://schemas.openxmlformats.org/officeDocument/2006/relationships" xmlns:m="http://schemas.openxmlformats.org/officeDocument/2006/math" xmlns:v="urn:schemas-microsoft-com:vml" xmlns:wp14="http://schemas.microsoft.com/office/word/2010/wordprocessingDrawing" xmlns:wp="http://schemas.openxmlformats.org/drawingml/2006/wordprocessingDrawing" xmlns:w10="urn:schemas-microsoft-com:office:word" xmlns:w="http://schemas.openxmlformats.org/wordprocessingml/2006/main" xmlns:w14="http://schemas.microsoft.com/office/word/2010/wordml" xmlns:w15="http://schemas.microsoft.com/office/word/2012/wordml" xmlns:wpg="http://schemas.microsoft.com/office/word/2010/wordprocessingGroup" xmlns:wpi="http://schemas.microsoft.com/office/word/2010/wordprocessingInk" xmlns:wne="http://schemas.microsoft.com/office/word/2006/wordml" xmlns:wps="http://schemas.microsoft.com/office/word/2010/wordprocessingShape" mc:Ignorable="w14 w15 wp14">
+<w:ftr xmlns:wpc="http://schemas.microsoft.com/office/word/2010/wordprocessingCanvas" xmlns:cx="http://schemas.microsoft.com/office/drawing/2014/chartex" xmlns:cx1="http://schemas.microsoft.com/office/drawing/2015/9/8/chartex" xmlns:cx2="http://schemas.microsoft.com/office/drawing/2015/10/21/chartex" xmlns:cx3="http://schemas.microsoft.com/office/drawing/2016/5/9/chartex" xmlns:cx4="http://schemas.microsoft.com/office/drawing/2016/5/10/chartex" xmlns:cx5="http://schemas.microsoft.com/office/drawing/2016/5/11/chartex" xmlns:cx6="http://schemas.microsoft.com/office/drawing/2016/5/12/chartex" xmlns:cx7="http://schemas.microsoft.com/office/drawing/2016/5/13/chartex" xmlns:cx8="http://schemas.microsoft.com/office/drawing/2016/5/14/chartex" xmlns:mc="http://schemas.openxmlformats.org/markup-compatibility/2006" xmlns:aink="http://schemas.microsoft.com/office/drawing/2016/ink" xmlns:am3d="http://schemas.microsoft.com/office/drawing/2017/model3d" xmlns:o="urn:schemas-microsoft-com:office:office" xmlns:oel="http://schemas.microsoft.com/office/2019/extlst" xmlns:r="http://schemas.openxmlformats.org/officeDocument/2006/relationships" xmlns:m="http://schemas.openxmlformats.org/officeDocument/2006/math" xmlns:v="urn:schemas-microsoft-com:vml" xmlns:wp14="http://schemas.microsoft.com/office/word/2010/wordprocessingDrawing" xmlns:wp="http://schemas.openxmlformats.org/drawingml/2006/wordprocessingDrawing" xmlns:w10="urn:schemas-microsoft-com:office:word" xmlns:w="http://schemas.openxmlformats.org/wordprocessingml/2006/main" xmlns:w14="http://schemas.microsoft.com/office/word/2010/wordml" xmlns:w15="http://schemas.microsoft.com/office/word/2012/wordml" xmlns:w16cex="http://schemas.microsoft.com/office/word/2018/wordml/cex" xmlns:w16cid="http://schemas.microsoft.com/office/word/2016/wordml/cid" xmlns:w16="http://schemas.microsoft.com/office/word/2018/wordml" xmlns:w16du="http://schemas.microsoft.com/office/word/2023/wordml/word16du" xmlns:w16sdtdh="http://schemas.microsoft.com/office/word/2020/wordml/sdtdatahash" xmlns:w16sdtfl="http://schemas.microsoft.com/office/word/2024/wordml/sdtformatlock" xmlns:w16se="http://schemas.microsoft.com/office/word/2015/wordml/symex" xmlns:wpg="http://schemas.microsoft.com/office/word/2010/wordprocessingGroup" xmlns:wpi="http://schemas.microsoft.com/office/word/2010/wordprocessingInk" xmlns:wne="http://schemas.microsoft.com/office/word/2006/wordml" xmlns:wps="http://schemas.microsoft.com/office/word/2010/wordprocessingShape" mc:Ignorable="w14 w15 w16se w16cid w16 w16cex w16sdtdh w16sdtfl w16du wp14">
   <w:p>
     <w:pPr>
       <w:pStyle w:val="Footer"/>
       <w:jc w:val="right"/>
     </w:pPr>
     <w:r>
-      <w:t xml:space="preserve">{{patient_name}}   |   Page </w:t>
+      <w:t>{{</w:t>
+    </w:r>
+    <w:proofErr w:type="spellStart"/>
+    <w:r>
+      <w:t>patient_name</w:t>
+    </w:r>
+    <w:proofErr w:type="spellEnd"/>
+    <w:proofErr w:type="gramStart"/>
+    <w:r>
+      <w:t xml:space="preserve">}}   </w:t>
+    </w:r>
+    <w:proofErr w:type="gramEnd"/>
+    <w:r>
+      <w:t xml:space="preserve">|   Page </w:t>
     </w:r>
     <w:r>
       <w:fldChar w:fldCharType="begin"/>
@@ -1524,7 +1677,7 @@
 </file>
 
 <file path=word/footnotes.xml><?xml version="1.0" encoding="utf-8"?>
-<w:footnotes xmlns:wpc="http://schemas.microsoft.com/office/word/2010/wordprocessingCanvas" xmlns:mc="http://schemas.openxmlformats.org/markup-compatibility/2006" xmlns:o="urn:schemas-microsoft-com:office:office" xmlns:r="http://schemas.openxmlformats.org/officeDocument/2006/relationships" xmlns:m="http://schemas.openxmlformats.org/officeDocument/2006/math" xmlns:v="urn:schemas-microsoft-com:vml" xmlns:wp14="http://schemas.microsoft.com/office/word/2010/wordprocessingDrawing" xmlns:wp="http://schemas.openxmlformats.org/drawingml/2006/wordprocessingDrawing" xmlns:w10="urn:schemas-microsoft-com:office:word" xmlns:w="http://schemas.openxmlformats.org/wordprocessingml/2006/main" xmlns:w14="http://schemas.microsoft.com/office/word/2010/wordml" xmlns:w15="http://schemas.microsoft.com/office/word/2012/wordml" xmlns:wpg="http://schemas.microsoft.com/office/word/2010/wordprocessingGroup" xmlns:wpi="http://schemas.microsoft.com/office/word/2010/wordprocessingInk" xmlns:wne="http://schemas.microsoft.com/office/word/2006/wordml" xmlns:wps="http://schemas.microsoft.com/office/word/2010/wordprocessingShape" mc:Ignorable="w14 w15 wp14">
+<w:footnotes xmlns:wpc="http://schemas.microsoft.com/office/word/2010/wordprocessingCanvas" xmlns:cx="http://schemas.microsoft.com/office/drawing/2014/chartex" xmlns:cx1="http://schemas.microsoft.com/office/drawing/2015/9/8/chartex" xmlns:cx2="http://schemas.microsoft.com/office/drawing/2015/10/21/chartex" xmlns:cx3="http://schemas.microsoft.com/office/drawing/2016/5/9/chartex" xmlns:cx4="http://schemas.microsoft.com/office/drawing/2016/5/10/chartex" xmlns:cx5="http://schemas.microsoft.com/office/drawing/2016/5/11/chartex" xmlns:cx6="http://schemas.microsoft.com/office/drawing/2016/5/12/chartex" xmlns:cx7="http://schemas.microsoft.com/office/drawing/2016/5/13/chartex" xmlns:cx8="http://schemas.microsoft.com/office/drawing/2016/5/14/chartex" xmlns:mc="http://schemas.openxmlformats.org/markup-compatibility/2006" xmlns:aink="http://schemas.microsoft.com/office/drawing/2016/ink" xmlns:am3d="http://schemas.microsoft.com/office/drawing/2017/model3d" xmlns:o="urn:schemas-microsoft-com:office:office" xmlns:oel="http://schemas.microsoft.com/office/2019/extlst" xmlns:r="http://schemas.openxmlformats.org/officeDocument/2006/relationships" xmlns:m="http://schemas.openxmlformats.org/officeDocument/2006/math" xmlns:v="urn:schemas-microsoft-com:vml" xmlns:wp14="http://schemas.microsoft.com/office/word/2010/wordprocessingDrawing" xmlns:wp="http://schemas.openxmlformats.org/drawingml/2006/wordprocessingDrawing" xmlns:w10="urn:schemas-microsoft-com:office:word" xmlns:w="http://schemas.openxmlformats.org/wordprocessingml/2006/main" xmlns:w14="http://schemas.microsoft.com/office/word/2010/wordml" xmlns:w15="http://schemas.microsoft.com/office/word/2012/wordml" xmlns:w16cex="http://schemas.microsoft.com/office/word/2018/wordml/cex" xmlns:w16cid="http://schemas.microsoft.com/office/word/2016/wordml/cid" xmlns:w16="http://schemas.microsoft.com/office/word/2018/wordml" xmlns:w16du="http://schemas.microsoft.com/office/word/2023/wordml/word16du" xmlns:w16sdtdh="http://schemas.microsoft.com/office/word/2020/wordml/sdtdatahash" xmlns:w16sdtfl="http://schemas.microsoft.com/office/word/2024/wordml/sdtformatlock" xmlns:w16se="http://schemas.microsoft.com/office/word/2015/wordml/symex" xmlns:wpg="http://schemas.microsoft.com/office/word/2010/wordprocessingGroup" xmlns:wpi="http://schemas.microsoft.com/office/word/2010/wordprocessingInk" xmlns:wne="http://schemas.microsoft.com/office/word/2006/wordml" xmlns:wps="http://schemas.microsoft.com/office/word/2010/wordprocessingShape" mc:Ignorable="w14 w15 w16se w16cid w16 w16cex w16sdtdh w16sdtfl w16du wp14">
   <w:footnote w:type="separator" w:id="-1">
     <w:p>
       <w:pPr>
@@ -1549,8 +1702,8 @@
 </file>
 
 <file path=word/numbering.xml><?xml version="1.0" encoding="utf-8"?>
-<w:numbering xmlns:wpc="http://schemas.microsoft.com/office/word/2010/wordprocessingCanvas" xmlns:mc="http://schemas.openxmlformats.org/markup-compatibility/2006" xmlns:o="urn:schemas-microsoft-com:office:office" xmlns:r="http://schemas.openxmlformats.org/officeDocument/2006/relationships" xmlns:m="http://schemas.openxmlformats.org/officeDocument/2006/math" xmlns:v="urn:schemas-microsoft-com:vml" xmlns:wp14="http://schemas.microsoft.com/office/word/2010/wordprocessingDrawing" xmlns:wp="http://schemas.openxmlformats.org/drawingml/2006/wordprocessingDrawing" xmlns:w10="urn:schemas-microsoft-com:office:word" xmlns:w="http://schemas.openxmlformats.org/wordprocessingml/2006/main" xmlns:w14="http://schemas.microsoft.com/office/word/2010/wordml" xmlns:w15="http://schemas.microsoft.com/office/word/2012/wordml" xmlns:wpg="http://schemas.microsoft.com/office/word/2010/wordprocessingGroup" xmlns:wpi="http://schemas.microsoft.com/office/word/2010/wordprocessingInk" xmlns:wne="http://schemas.microsoft.com/office/word/2006/wordml" xmlns:wps="http://schemas.microsoft.com/office/word/2010/wordprocessingShape" mc:Ignorable="w14 w15 wp14">
-  <w:abstractNum w:abstractNumId="0">
+<w:numbering xmlns:wpc="http://schemas.microsoft.com/office/word/2010/wordprocessingCanvas" xmlns:cx="http://schemas.microsoft.com/office/drawing/2014/chartex" xmlns:cx1="http://schemas.microsoft.com/office/drawing/2015/9/8/chartex" xmlns:cx2="http://schemas.microsoft.com/office/drawing/2015/10/21/chartex" xmlns:cx3="http://schemas.microsoft.com/office/drawing/2016/5/9/chartex" xmlns:cx4="http://schemas.microsoft.com/office/drawing/2016/5/10/chartex" xmlns:cx5="http://schemas.microsoft.com/office/drawing/2016/5/11/chartex" xmlns:cx6="http://schemas.microsoft.com/office/drawing/2016/5/12/chartex" xmlns:cx7="http://schemas.microsoft.com/office/drawing/2016/5/13/chartex" xmlns:cx8="http://schemas.microsoft.com/office/drawing/2016/5/14/chartex" xmlns:mc="http://schemas.openxmlformats.org/markup-compatibility/2006" xmlns:aink="http://schemas.microsoft.com/office/drawing/2016/ink" xmlns:am3d="http://schemas.microsoft.com/office/drawing/2017/model3d" xmlns:o="urn:schemas-microsoft-com:office:office" xmlns:oel="http://schemas.microsoft.com/office/2019/extlst" xmlns:r="http://schemas.openxmlformats.org/officeDocument/2006/relationships" xmlns:m="http://schemas.openxmlformats.org/officeDocument/2006/math" xmlns:v="urn:schemas-microsoft-com:vml" xmlns:wp14="http://schemas.microsoft.com/office/word/2010/wordprocessingDrawing" xmlns:wp="http://schemas.openxmlformats.org/drawingml/2006/wordprocessingDrawing" xmlns:w10="urn:schemas-microsoft-com:office:word" xmlns:w="http://schemas.openxmlformats.org/wordprocessingml/2006/main" xmlns:w14="http://schemas.microsoft.com/office/word/2010/wordml" xmlns:w15="http://schemas.microsoft.com/office/word/2012/wordml" xmlns:w16cex="http://schemas.microsoft.com/office/word/2018/wordml/cex" xmlns:w16cid="http://schemas.microsoft.com/office/word/2016/wordml/cid" xmlns:w16="http://schemas.microsoft.com/office/word/2018/wordml" xmlns:w16du="http://schemas.microsoft.com/office/word/2023/wordml/word16du" xmlns:w16sdtdh="http://schemas.microsoft.com/office/word/2020/wordml/sdtdatahash" xmlns:w16sdtfl="http://schemas.microsoft.com/office/word/2024/wordml/sdtformatlock" xmlns:w16se="http://schemas.microsoft.com/office/word/2015/wordml/symex" xmlns:wpg="http://schemas.microsoft.com/office/word/2010/wordprocessingGroup" xmlns:wpi="http://schemas.microsoft.com/office/word/2010/wordprocessingInk" xmlns:wne="http://schemas.microsoft.com/office/word/2006/wordml" xmlns:wps="http://schemas.microsoft.com/office/word/2010/wordprocessingShape" mc:Ignorable="w14 w15 w16se w16cid w16 w16cex w16sdtdh w16sdtfl w16du wp14">
+  <w:abstractNum w:abstractNumId="0" w15:restartNumberingAfterBreak="0">
     <w:nsid w:val="FFFFFF7C"/>
     <w:multiLevelType w:val="singleLevel"/>
     <w:tmpl w:val="C310EC42"/>
@@ -1567,7 +1720,7 @@
       </w:pPr>
     </w:lvl>
   </w:abstractNum>
-  <w:abstractNum w:abstractNumId="1">
+  <w:abstractNum w:abstractNumId="1" w15:restartNumberingAfterBreak="0">
     <w:nsid w:val="FFFFFF7D"/>
     <w:multiLevelType w:val="singleLevel"/>
     <w:tmpl w:val="E4089024"/>
@@ -1584,7 +1737,7 @@
       </w:pPr>
     </w:lvl>
   </w:abstractNum>
-  <w:abstractNum w:abstractNumId="2">
+  <w:abstractNum w:abstractNumId="2" w15:restartNumberingAfterBreak="0">
     <w:nsid w:val="FFFFFF7E"/>
     <w:multiLevelType w:val="singleLevel"/>
     <w:tmpl w:val="FB12693A"/>
@@ -1602,7 +1755,7 @@
       </w:pPr>
     </w:lvl>
   </w:abstractNum>
-  <w:abstractNum w:abstractNumId="3">
+  <w:abstractNum w:abstractNumId="3" w15:restartNumberingAfterBreak="0">
     <w:nsid w:val="FFFFFF7F"/>
     <w:multiLevelType w:val="singleLevel"/>
     <w:tmpl w:val="38441652"/>
@@ -1620,7 +1773,7 @@
       </w:pPr>
     </w:lvl>
   </w:abstractNum>
-  <w:abstractNum w:abstractNumId="4">
+  <w:abstractNum w:abstractNumId="4" w15:restartNumberingAfterBreak="0">
     <w:nsid w:val="FFFFFF81"/>
     <w:multiLevelType w:val="singleLevel"/>
     <w:tmpl w:val="171AC3A4"/>
@@ -1640,7 +1793,7 @@
       </w:rPr>
     </w:lvl>
   </w:abstractNum>
-  <w:abstractNum w:abstractNumId="5">
+  <w:abstractNum w:abstractNumId="5" w15:restartNumberingAfterBreak="0">
     <w:nsid w:val="FFFFFF82"/>
     <w:multiLevelType w:val="singleLevel"/>
     <w:tmpl w:val="F3EAFDEC"/>
@@ -1661,7 +1814,7 @@
       </w:rPr>
     </w:lvl>
   </w:abstractNum>
-  <w:abstractNum w:abstractNumId="6">
+  <w:abstractNum w:abstractNumId="6" w15:restartNumberingAfterBreak="0">
     <w:nsid w:val="FFFFFF83"/>
     <w:multiLevelType w:val="singleLevel"/>
     <w:tmpl w:val="3D1EFFD4"/>
@@ -1682,7 +1835,7 @@
       </w:rPr>
     </w:lvl>
   </w:abstractNum>
-  <w:abstractNum w:abstractNumId="7">
+  <w:abstractNum w:abstractNumId="7" w15:restartNumberingAfterBreak="0">
     <w:nsid w:val="FFFFFF88"/>
     <w:multiLevelType w:val="singleLevel"/>
     <w:tmpl w:val="D0A62B40"/>
@@ -1700,7 +1853,7 @@
       </w:pPr>
     </w:lvl>
   </w:abstractNum>
-  <w:abstractNum w:abstractNumId="8">
+  <w:abstractNum w:abstractNumId="8" w15:restartNumberingAfterBreak="0">
     <w:nsid w:val="FFFFFF89"/>
     <w:multiLevelType w:val="singleLevel"/>
     <w:tmpl w:val="29761A62"/>
@@ -1721,38 +1874,272 @@
       </w:rPr>
     </w:lvl>
   </w:abstractNum>
-  <w:num w:numId="1">
+  <w:abstractNum w:abstractNumId="9" w15:restartNumberingAfterBreak="0">
+    <w:nsid w:val="0FB67337"/>
+    <w:multiLevelType w:val="hybridMultilevel"/>
+    <w:tmpl w:val="1864F368"/>
+    <w:lvl w:ilvl="0" w:tplc="40090009">
+      <w:start w:val="1"/>
+      <w:numFmt w:val="bullet"/>
+      <w:lvlText w:val=""/>
+      <w:lvlJc w:val="left"/>
+      <w:pPr>
+        <w:ind w:left="360" w:hanging="360"/>
+      </w:pPr>
+      <w:rPr>
+        <w:rFonts w:ascii="Wingdings" w:hAnsi="Wingdings" w:hint="default"/>
+      </w:rPr>
+    </w:lvl>
+    <w:lvl w:ilvl="1" w:tplc="40090003" w:tentative="1">
+      <w:start w:val="1"/>
+      <w:numFmt w:val="bullet"/>
+      <w:lvlText w:val="o"/>
+      <w:lvlJc w:val="left"/>
+      <w:pPr>
+        <w:ind w:left="1080" w:hanging="360"/>
+      </w:pPr>
+      <w:rPr>
+        <w:rFonts w:ascii="Courier New" w:hAnsi="Courier New" w:cs="Courier New" w:hint="default"/>
+      </w:rPr>
+    </w:lvl>
+    <w:lvl w:ilvl="2" w:tplc="40090005" w:tentative="1">
+      <w:start w:val="1"/>
+      <w:numFmt w:val="bullet"/>
+      <w:lvlText w:val=""/>
+      <w:lvlJc w:val="left"/>
+      <w:pPr>
+        <w:ind w:left="1800" w:hanging="360"/>
+      </w:pPr>
+      <w:rPr>
+        <w:rFonts w:ascii="Wingdings" w:hAnsi="Wingdings" w:hint="default"/>
+      </w:rPr>
+    </w:lvl>
+    <w:lvl w:ilvl="3" w:tplc="40090001" w:tentative="1">
+      <w:start w:val="1"/>
+      <w:numFmt w:val="bullet"/>
+      <w:lvlText w:val=""/>
+      <w:lvlJc w:val="left"/>
+      <w:pPr>
+        <w:ind w:left="2520" w:hanging="360"/>
+      </w:pPr>
+      <w:rPr>
+        <w:rFonts w:ascii="Symbol" w:hAnsi="Symbol" w:hint="default"/>
+      </w:rPr>
+    </w:lvl>
+    <w:lvl w:ilvl="4" w:tplc="40090003" w:tentative="1">
+      <w:start w:val="1"/>
+      <w:numFmt w:val="bullet"/>
+      <w:lvlText w:val="o"/>
+      <w:lvlJc w:val="left"/>
+      <w:pPr>
+        <w:ind w:left="3240" w:hanging="360"/>
+      </w:pPr>
+      <w:rPr>
+        <w:rFonts w:ascii="Courier New" w:hAnsi="Courier New" w:cs="Courier New" w:hint="default"/>
+      </w:rPr>
+    </w:lvl>
+    <w:lvl w:ilvl="5" w:tplc="40090005" w:tentative="1">
+      <w:start w:val="1"/>
+      <w:numFmt w:val="bullet"/>
+      <w:lvlText w:val=""/>
+      <w:lvlJc w:val="left"/>
+      <w:pPr>
+        <w:ind w:left="3960" w:hanging="360"/>
+      </w:pPr>
+      <w:rPr>
+        <w:rFonts w:ascii="Wingdings" w:hAnsi="Wingdings" w:hint="default"/>
+      </w:rPr>
+    </w:lvl>
+    <w:lvl w:ilvl="6" w:tplc="40090001" w:tentative="1">
+      <w:start w:val="1"/>
+      <w:numFmt w:val="bullet"/>
+      <w:lvlText w:val=""/>
+      <w:lvlJc w:val="left"/>
+      <w:pPr>
+        <w:ind w:left="4680" w:hanging="360"/>
+      </w:pPr>
+      <w:rPr>
+        <w:rFonts w:ascii="Symbol" w:hAnsi="Symbol" w:hint="default"/>
+      </w:rPr>
+    </w:lvl>
+    <w:lvl w:ilvl="7" w:tplc="40090003" w:tentative="1">
+      <w:start w:val="1"/>
+      <w:numFmt w:val="bullet"/>
+      <w:lvlText w:val="o"/>
+      <w:lvlJc w:val="left"/>
+      <w:pPr>
+        <w:ind w:left="5400" w:hanging="360"/>
+      </w:pPr>
+      <w:rPr>
+        <w:rFonts w:ascii="Courier New" w:hAnsi="Courier New" w:cs="Courier New" w:hint="default"/>
+      </w:rPr>
+    </w:lvl>
+    <w:lvl w:ilvl="8" w:tplc="40090005" w:tentative="1">
+      <w:start w:val="1"/>
+      <w:numFmt w:val="bullet"/>
+      <w:lvlText w:val=""/>
+      <w:lvlJc w:val="left"/>
+      <w:pPr>
+        <w:ind w:left="6120" w:hanging="360"/>
+      </w:pPr>
+      <w:rPr>
+        <w:rFonts w:ascii="Wingdings" w:hAnsi="Wingdings" w:hint="default"/>
+      </w:rPr>
+    </w:lvl>
+  </w:abstractNum>
+  <w:abstractNum w:abstractNumId="10" w15:restartNumberingAfterBreak="0">
+    <w:nsid w:val="6CFC4F9D"/>
+    <w:multiLevelType w:val="hybridMultilevel"/>
+    <w:tmpl w:val="97C259D0"/>
+    <w:lvl w:ilvl="0" w:tplc="40090001">
+      <w:start w:val="1"/>
+      <w:numFmt w:val="bullet"/>
+      <w:lvlText w:val=""/>
+      <w:lvlJc w:val="left"/>
+      <w:pPr>
+        <w:ind w:left="360" w:hanging="360"/>
+      </w:pPr>
+      <w:rPr>
+        <w:rFonts w:ascii="Symbol" w:hAnsi="Symbol" w:hint="default"/>
+      </w:rPr>
+    </w:lvl>
+    <w:lvl w:ilvl="1" w:tplc="DAB8732C">
+      <w:start w:val="1"/>
+      <w:numFmt w:val="bullet"/>
+      <w:lvlText w:val="o"/>
+      <w:lvlJc w:val="left"/>
+      <w:pPr>
+        <w:ind w:left="1080" w:hanging="360"/>
+      </w:pPr>
+      <w:rPr>
+        <w:rFonts w:ascii="Courier New" w:hAnsi="Courier New" w:cs="Courier New" w:hint="default"/>
+        <w:b/>
+        <w:bCs/>
+      </w:rPr>
+    </w:lvl>
+    <w:lvl w:ilvl="2" w:tplc="40090005" w:tentative="1">
+      <w:start w:val="1"/>
+      <w:numFmt w:val="bullet"/>
+      <w:lvlText w:val=""/>
+      <w:lvlJc w:val="left"/>
+      <w:pPr>
+        <w:ind w:left="1800" w:hanging="360"/>
+      </w:pPr>
+      <w:rPr>
+        <w:rFonts w:ascii="Wingdings" w:hAnsi="Wingdings" w:hint="default"/>
+      </w:rPr>
+    </w:lvl>
+    <w:lvl w:ilvl="3" w:tplc="40090001" w:tentative="1">
+      <w:start w:val="1"/>
+      <w:numFmt w:val="bullet"/>
+      <w:lvlText w:val=""/>
+      <w:lvlJc w:val="left"/>
+      <w:pPr>
+        <w:ind w:left="2520" w:hanging="360"/>
+      </w:pPr>
+      <w:rPr>
+        <w:rFonts w:ascii="Symbol" w:hAnsi="Symbol" w:hint="default"/>
+      </w:rPr>
+    </w:lvl>
+    <w:lvl w:ilvl="4" w:tplc="40090003" w:tentative="1">
+      <w:start w:val="1"/>
+      <w:numFmt w:val="bullet"/>
+      <w:lvlText w:val="o"/>
+      <w:lvlJc w:val="left"/>
+      <w:pPr>
+        <w:ind w:left="3240" w:hanging="360"/>
+      </w:pPr>
+      <w:rPr>
+        <w:rFonts w:ascii="Courier New" w:hAnsi="Courier New" w:cs="Courier New" w:hint="default"/>
+      </w:rPr>
+    </w:lvl>
+    <w:lvl w:ilvl="5" w:tplc="40090005" w:tentative="1">
+      <w:start w:val="1"/>
+      <w:numFmt w:val="bullet"/>
+      <w:lvlText w:val=""/>
+      <w:lvlJc w:val="left"/>
+      <w:pPr>
+        <w:ind w:left="3960" w:hanging="360"/>
+      </w:pPr>
+      <w:rPr>
+        <w:rFonts w:ascii="Wingdings" w:hAnsi="Wingdings" w:hint="default"/>
+      </w:rPr>
+    </w:lvl>
+    <w:lvl w:ilvl="6" w:tplc="40090001" w:tentative="1">
+      <w:start w:val="1"/>
+      <w:numFmt w:val="bullet"/>
+      <w:lvlText w:val=""/>
+      <w:lvlJc w:val="left"/>
+      <w:pPr>
+        <w:ind w:left="4680" w:hanging="360"/>
+      </w:pPr>
+      <w:rPr>
+        <w:rFonts w:ascii="Symbol" w:hAnsi="Symbol" w:hint="default"/>
+      </w:rPr>
+    </w:lvl>
+    <w:lvl w:ilvl="7" w:tplc="40090003" w:tentative="1">
+      <w:start w:val="1"/>
+      <w:numFmt w:val="bullet"/>
+      <w:lvlText w:val="o"/>
+      <w:lvlJc w:val="left"/>
+      <w:pPr>
+        <w:ind w:left="5400" w:hanging="360"/>
+      </w:pPr>
+      <w:rPr>
+        <w:rFonts w:ascii="Courier New" w:hAnsi="Courier New" w:cs="Courier New" w:hint="default"/>
+      </w:rPr>
+    </w:lvl>
+    <w:lvl w:ilvl="8" w:tplc="40090005" w:tentative="1">
+      <w:start w:val="1"/>
+      <w:numFmt w:val="bullet"/>
+      <w:lvlText w:val=""/>
+      <w:lvlJc w:val="left"/>
+      <w:pPr>
+        <w:ind w:left="6120" w:hanging="360"/>
+      </w:pPr>
+      <w:rPr>
+        <w:rFonts w:ascii="Wingdings" w:hAnsi="Wingdings" w:hint="default"/>
+      </w:rPr>
+    </w:lvl>
+  </w:abstractNum>
+  <w:num w:numId="1" w16cid:durableId="1617635770">
     <w:abstractNumId w:val="8"/>
   </w:num>
-  <w:num w:numId="2">
+  <w:num w:numId="2" w16cid:durableId="408578239">
     <w:abstractNumId w:val="6"/>
   </w:num>
-  <w:num w:numId="3">
+  <w:num w:numId="3" w16cid:durableId="449204313">
     <w:abstractNumId w:val="5"/>
   </w:num>
-  <w:num w:numId="4">
+  <w:num w:numId="4" w16cid:durableId="1255942698">
     <w:abstractNumId w:val="4"/>
   </w:num>
-  <w:num w:numId="5">
+  <w:num w:numId="5" w16cid:durableId="1065491808">
     <w:abstractNumId w:val="7"/>
   </w:num>
-  <w:num w:numId="6">
+  <w:num w:numId="6" w16cid:durableId="832916558">
     <w:abstractNumId w:val="3"/>
   </w:num>
-  <w:num w:numId="7">
+  <w:num w:numId="7" w16cid:durableId="1225750611">
     <w:abstractNumId w:val="2"/>
   </w:num>
-  <w:num w:numId="8">
+  <w:num w:numId="8" w16cid:durableId="1638755011">
     <w:abstractNumId w:val="1"/>
   </w:num>
-  <w:num w:numId="9">
+  <w:num w:numId="9" w16cid:durableId="1503083512">
     <w:abstractNumId w:val="0"/>
+  </w:num>
+  <w:num w:numId="10" w16cid:durableId="2106877858">
+    <w:abstractNumId w:val="10"/>
+  </w:num>
+  <w:num w:numId="11" w16cid:durableId="1576040829">
+    <w:abstractNumId w:val="9"/>
   </w:num>
 </w:numbering>
 </file>
 
 <file path=word/styles.xml><?xml version="1.0" encoding="utf-8"?>
-<w:styles xmlns:mc="http://schemas.openxmlformats.org/markup-compatibility/2006" xmlns:r="http://schemas.openxmlformats.org/officeDocument/2006/relationships" xmlns:w="http://schemas.openxmlformats.org/wordprocessingml/2006/main" xmlns:w14="http://schemas.microsoft.com/office/word/2010/wordml" xmlns:w15="http://schemas.microsoft.com/office/word/2012/wordml" mc:Ignorable="w14 w15">
+<w:styles xmlns:mc="http://schemas.openxmlformats.org/markup-compatibility/2006" xmlns:r="http://schemas.openxmlformats.org/officeDocument/2006/relationships" xmlns:w="http://schemas.openxmlformats.org/wordprocessingml/2006/main" xmlns:w14="http://schemas.microsoft.com/office/word/2010/wordml" xmlns:w15="http://schemas.microsoft.com/office/word/2012/wordml" xmlns:w16cex="http://schemas.microsoft.com/office/word/2018/wordml/cex" xmlns:w16cid="http://schemas.microsoft.com/office/word/2016/wordml/cid" xmlns:w16="http://schemas.microsoft.com/office/word/2018/wordml" xmlns:w16du="http://schemas.microsoft.com/office/word/2023/wordml/word16du" xmlns:w16sdtdh="http://schemas.microsoft.com/office/word/2020/wordml/sdtdatahash" xmlns:w16sdtfl="http://schemas.microsoft.com/office/word/2024/wordml/sdtformatlock" xmlns:w16se="http://schemas.microsoft.com/office/word/2015/wordml/symex" mc:Ignorable="w14 w15 w16se w16cid w16 w16cex w16sdtdh w16sdtfl w16du">
   <w:docDefaults>
     <w:rPrDefault>
       <w:rPr>
@@ -1768,7 +2155,7 @@
       </w:pPr>
     </w:pPrDefault>
   </w:docDefaults>
-  <w:latentStyles w:defLockedState="0" w:defUIPriority="99" w:defSemiHidden="0" w:defUnhideWhenUsed="0" w:defQFormat="0" w:count="371">
+  <w:latentStyles w:defLockedState="0" w:defUIPriority="99" w:defSemiHidden="0" w:defUnhideWhenUsed="0" w:defQFormat="0" w:count="376">
     <w:lsdException w:name="Normal" w:uiPriority="0" w:qFormat="1"/>
     <w:lsdException w:name="heading 1" w:uiPriority="9" w:qFormat="1"/>
     <w:lsdException w:name="heading 2" w:semiHidden="1" w:uiPriority="9" w:unhideWhenUsed="1" w:qFormat="1"/>
@@ -2131,6 +2518,11 @@
     <w:lsdException w:name="List Table 5 Dark Accent 6" w:uiPriority="50"/>
     <w:lsdException w:name="List Table 6 Colorful Accent 6" w:uiPriority="51"/>
     <w:lsdException w:name="List Table 7 Colorful Accent 6" w:uiPriority="52"/>
+    <w:lsdException w:name="Mention" w:semiHidden="1" w:unhideWhenUsed="1"/>
+    <w:lsdException w:name="Smart Hyperlink" w:semiHidden="1" w:unhideWhenUsed="1"/>
+    <w:lsdException w:name="Hashtag" w:semiHidden="1" w:unhideWhenUsed="1"/>
+    <w:lsdException w:name="Unresolved Mention" w:semiHidden="1" w:unhideWhenUsed="1"/>
+    <w:lsdException w:name="Smart Link" w:semiHidden="1" w:unhideWhenUsed="1"/>
   </w:latentStyles>
   <w:style w:type="paragraph" w:default="1" w:styleId="Normal">
     <w:name w:val="Normal"/>
@@ -3087,7 +3479,6 @@
       <w:spacing w:after="0" w:line="240" w:lineRule="auto"/>
     </w:pPr>
     <w:tblPr>
-      <w:tblInd w:w="0" w:type="dxa"/>
       <w:tblBorders>
         <w:top w:val="single" w:sz="4" w:space="0" w:color="auto"/>
         <w:left w:val="single" w:sz="4" w:space="0" w:color="auto"/>
@@ -3096,12 +3487,6 @@
         <w:insideH w:val="single" w:sz="4" w:space="0" w:color="auto"/>
         <w:insideV w:val="single" w:sz="4" w:space="0" w:color="auto"/>
       </w:tblBorders>
-      <w:tblCellMar>
-        <w:top w:w="0" w:type="dxa"/>
-        <w:left w:w="108" w:type="dxa"/>
-        <w:bottom w:w="0" w:type="dxa"/>
-        <w:right w:w="108" w:type="dxa"/>
-      </w:tblCellMar>
     </w:tblPr>
   </w:style>
   <w:style w:type="table" w:styleId="LightShading">
@@ -3118,17 +3503,10 @@
     <w:tblPr>
       <w:tblStyleRowBandSize w:val="1"/>
       <w:tblStyleColBandSize w:val="1"/>
-      <w:tblInd w:w="0" w:type="dxa"/>
       <w:tblBorders>
         <w:top w:val="single" w:sz="8" w:space="0" w:color="000000" w:themeColor="text1"/>
         <w:bottom w:val="single" w:sz="8" w:space="0" w:color="000000" w:themeColor="text1"/>
       </w:tblBorders>
-      <w:tblCellMar>
-        <w:top w:w="0" w:type="dxa"/>
-        <w:left w:w="108" w:type="dxa"/>
-        <w:bottom w:w="0" w:type="dxa"/>
-        <w:right w:w="108" w:type="dxa"/>
-      </w:tblCellMar>
     </w:tblPr>
     <w:tblStylePr w:type="firstRow">
       <w:pPr>
@@ -3221,17 +3599,10 @@
     <w:tblPr>
       <w:tblStyleRowBandSize w:val="1"/>
       <w:tblStyleColBandSize w:val="1"/>
-      <w:tblInd w:w="0" w:type="dxa"/>
       <w:tblBorders>
         <w:top w:val="single" w:sz="8" w:space="0" w:color="4F81BD" w:themeColor="accent1"/>
         <w:bottom w:val="single" w:sz="8" w:space="0" w:color="4F81BD" w:themeColor="accent1"/>
       </w:tblBorders>
-      <w:tblCellMar>
-        <w:top w:w="0" w:type="dxa"/>
-        <w:left w:w="108" w:type="dxa"/>
-        <w:bottom w:w="0" w:type="dxa"/>
-        <w:right w:w="108" w:type="dxa"/>
-      </w:tblCellMar>
     </w:tblPr>
     <w:tblStylePr w:type="firstRow">
       <w:pPr>
@@ -3324,17 +3695,10 @@
     <w:tblPr>
       <w:tblStyleRowBandSize w:val="1"/>
       <w:tblStyleColBandSize w:val="1"/>
-      <w:tblInd w:w="0" w:type="dxa"/>
       <w:tblBorders>
         <w:top w:val="single" w:sz="8" w:space="0" w:color="C0504D" w:themeColor="accent2"/>
         <w:bottom w:val="single" w:sz="8" w:space="0" w:color="C0504D" w:themeColor="accent2"/>
       </w:tblBorders>
-      <w:tblCellMar>
-        <w:top w:w="0" w:type="dxa"/>
-        <w:left w:w="108" w:type="dxa"/>
-        <w:bottom w:w="0" w:type="dxa"/>
-        <w:right w:w="108" w:type="dxa"/>
-      </w:tblCellMar>
     </w:tblPr>
     <w:tblStylePr w:type="firstRow">
       <w:pPr>
@@ -3427,17 +3791,10 @@
     <w:tblPr>
       <w:tblStyleRowBandSize w:val="1"/>
       <w:tblStyleColBandSize w:val="1"/>
-      <w:tblInd w:w="0" w:type="dxa"/>
       <w:tblBorders>
         <w:top w:val="single" w:sz="8" w:space="0" w:color="9BBB59" w:themeColor="accent3"/>
         <w:bottom w:val="single" w:sz="8" w:space="0" w:color="9BBB59" w:themeColor="accent3"/>
       </w:tblBorders>
-      <w:tblCellMar>
-        <w:top w:w="0" w:type="dxa"/>
-        <w:left w:w="108" w:type="dxa"/>
-        <w:bottom w:w="0" w:type="dxa"/>
-        <w:right w:w="108" w:type="dxa"/>
-      </w:tblCellMar>
     </w:tblPr>
     <w:tblStylePr w:type="firstRow">
       <w:pPr>
@@ -3530,17 +3887,10 @@
     <w:tblPr>
       <w:tblStyleRowBandSize w:val="1"/>
       <w:tblStyleColBandSize w:val="1"/>
-      <w:tblInd w:w="0" w:type="dxa"/>
       <w:tblBorders>
         <w:top w:val="single" w:sz="8" w:space="0" w:color="8064A2" w:themeColor="accent4"/>
         <w:bottom w:val="single" w:sz="8" w:space="0" w:color="8064A2" w:themeColor="accent4"/>
       </w:tblBorders>
-      <w:tblCellMar>
-        <w:top w:w="0" w:type="dxa"/>
-        <w:left w:w="108" w:type="dxa"/>
-        <w:bottom w:w="0" w:type="dxa"/>
-        <w:right w:w="108" w:type="dxa"/>
-      </w:tblCellMar>
     </w:tblPr>
     <w:tblStylePr w:type="firstRow">
       <w:pPr>
@@ -3633,17 +3983,10 @@
     <w:tblPr>
       <w:tblStyleRowBandSize w:val="1"/>
       <w:tblStyleColBandSize w:val="1"/>
-      <w:tblInd w:w="0" w:type="dxa"/>
       <w:tblBorders>
         <w:top w:val="single" w:sz="8" w:space="0" w:color="4BACC6" w:themeColor="accent5"/>
         <w:bottom w:val="single" w:sz="8" w:space="0" w:color="4BACC6" w:themeColor="accent5"/>
       </w:tblBorders>
-      <w:tblCellMar>
-        <w:top w:w="0" w:type="dxa"/>
-        <w:left w:w="108" w:type="dxa"/>
-        <w:bottom w:w="0" w:type="dxa"/>
-        <w:right w:w="108" w:type="dxa"/>
-      </w:tblCellMar>
     </w:tblPr>
     <w:tblStylePr w:type="firstRow">
       <w:pPr>
@@ -3736,17 +4079,10 @@
     <w:tblPr>
       <w:tblStyleRowBandSize w:val="1"/>
       <w:tblStyleColBandSize w:val="1"/>
-      <w:tblInd w:w="0" w:type="dxa"/>
       <w:tblBorders>
         <w:top w:val="single" w:sz="8" w:space="0" w:color="F79646" w:themeColor="accent6"/>
         <w:bottom w:val="single" w:sz="8" w:space="0" w:color="F79646" w:themeColor="accent6"/>
       </w:tblBorders>
-      <w:tblCellMar>
-        <w:top w:w="0" w:type="dxa"/>
-        <w:left w:w="108" w:type="dxa"/>
-        <w:bottom w:w="0" w:type="dxa"/>
-        <w:right w:w="108" w:type="dxa"/>
-      </w:tblCellMar>
     </w:tblPr>
     <w:tblStylePr w:type="firstRow">
       <w:pPr>
@@ -3836,19 +4172,12 @@
     <w:tblPr>
       <w:tblStyleRowBandSize w:val="1"/>
       <w:tblStyleColBandSize w:val="1"/>
-      <w:tblInd w:w="0" w:type="dxa"/>
       <w:tblBorders>
         <w:top w:val="single" w:sz="8" w:space="0" w:color="000000" w:themeColor="text1"/>
         <w:left w:val="single" w:sz="8" w:space="0" w:color="000000" w:themeColor="text1"/>
         <w:bottom w:val="single" w:sz="8" w:space="0" w:color="000000" w:themeColor="text1"/>
         <w:right w:val="single" w:sz="8" w:space="0" w:color="000000" w:themeColor="text1"/>
       </w:tblBorders>
-      <w:tblCellMar>
-        <w:top w:w="0" w:type="dxa"/>
-        <w:left w:w="108" w:type="dxa"/>
-        <w:bottom w:w="0" w:type="dxa"/>
-        <w:right w:w="108" w:type="dxa"/>
-      </w:tblCellMar>
     </w:tblPr>
     <w:tblStylePr w:type="firstRow">
       <w:pPr>
@@ -3928,19 +4257,12 @@
     <w:tblPr>
       <w:tblStyleRowBandSize w:val="1"/>
       <w:tblStyleColBandSize w:val="1"/>
-      <w:tblInd w:w="0" w:type="dxa"/>
       <w:tblBorders>
         <w:top w:val="single" w:sz="8" w:space="0" w:color="4F81BD" w:themeColor="accent1"/>
         <w:left w:val="single" w:sz="8" w:space="0" w:color="4F81BD" w:themeColor="accent1"/>
         <w:bottom w:val="single" w:sz="8" w:space="0" w:color="4F81BD" w:themeColor="accent1"/>
         <w:right w:val="single" w:sz="8" w:space="0" w:color="4F81BD" w:themeColor="accent1"/>
       </w:tblBorders>
-      <w:tblCellMar>
-        <w:top w:w="0" w:type="dxa"/>
-        <w:left w:w="108" w:type="dxa"/>
-        <w:bottom w:w="0" w:type="dxa"/>
-        <w:right w:w="108" w:type="dxa"/>
-      </w:tblCellMar>
     </w:tblPr>
     <w:tblStylePr w:type="firstRow">
       <w:pPr>
@@ -4020,19 +4342,12 @@
     <w:tblPr>
       <w:tblStyleRowBandSize w:val="1"/>
       <w:tblStyleColBandSize w:val="1"/>
-      <w:tblInd w:w="0" w:type="dxa"/>
       <w:tblBorders>
         <w:top w:val="single" w:sz="8" w:space="0" w:color="C0504D" w:themeColor="accent2"/>
         <w:left w:val="single" w:sz="8" w:space="0" w:color="C0504D" w:themeColor="accent2"/>
         <w:bottom w:val="single" w:sz="8" w:space="0" w:color="C0504D" w:themeColor="accent2"/>
         <w:right w:val="single" w:sz="8" w:space="0" w:color="C0504D" w:themeColor="accent2"/>
       </w:tblBorders>
-      <w:tblCellMar>
-        <w:top w:w="0" w:type="dxa"/>
-        <w:left w:w="108" w:type="dxa"/>
-        <w:bottom w:w="0" w:type="dxa"/>
-        <w:right w:w="108" w:type="dxa"/>
-      </w:tblCellMar>
     </w:tblPr>
     <w:tblStylePr w:type="firstRow">
       <w:pPr>
@@ -4112,19 +4427,12 @@
     <w:tblPr>
       <w:tblStyleRowBandSize w:val="1"/>
       <w:tblStyleColBandSize w:val="1"/>
-      <w:tblInd w:w="0" w:type="dxa"/>
       <w:tblBorders>
         <w:top w:val="single" w:sz="8" w:space="0" w:color="9BBB59" w:themeColor="accent3"/>
         <w:left w:val="single" w:sz="8" w:space="0" w:color="9BBB59" w:themeColor="accent3"/>
         <w:bottom w:val="single" w:sz="8" w:space="0" w:color="9BBB59" w:themeColor="accent3"/>
         <w:right w:val="single" w:sz="8" w:space="0" w:color="9BBB59" w:themeColor="accent3"/>
       </w:tblBorders>
-      <w:tblCellMar>
-        <w:top w:w="0" w:type="dxa"/>
-        <w:left w:w="108" w:type="dxa"/>
-        <w:bottom w:w="0" w:type="dxa"/>
-        <w:right w:w="108" w:type="dxa"/>
-      </w:tblCellMar>
     </w:tblPr>
     <w:tblStylePr w:type="firstRow">
       <w:pPr>
@@ -4204,19 +4512,12 @@
     <w:tblPr>
       <w:tblStyleRowBandSize w:val="1"/>
       <w:tblStyleColBandSize w:val="1"/>
-      <w:tblInd w:w="0" w:type="dxa"/>
       <w:tblBorders>
         <w:top w:val="single" w:sz="8" w:space="0" w:color="8064A2" w:themeColor="accent4"/>
         <w:left w:val="single" w:sz="8" w:space="0" w:color="8064A2" w:themeColor="accent4"/>
         <w:bottom w:val="single" w:sz="8" w:space="0" w:color="8064A2" w:themeColor="accent4"/>
         <w:right w:val="single" w:sz="8" w:space="0" w:color="8064A2" w:themeColor="accent4"/>
       </w:tblBorders>
-      <w:tblCellMar>
-        <w:top w:w="0" w:type="dxa"/>
-        <w:left w:w="108" w:type="dxa"/>
-        <w:bottom w:w="0" w:type="dxa"/>
-        <w:right w:w="108" w:type="dxa"/>
-      </w:tblCellMar>
     </w:tblPr>
     <w:tblStylePr w:type="firstRow">
       <w:pPr>
@@ -4296,19 +4597,12 @@
     <w:tblPr>
       <w:tblStyleRowBandSize w:val="1"/>
       <w:tblStyleColBandSize w:val="1"/>
-      <w:tblInd w:w="0" w:type="dxa"/>
       <w:tblBorders>
         <w:top w:val="single" w:sz="8" w:space="0" w:color="4BACC6" w:themeColor="accent5"/>
         <w:left w:val="single" w:sz="8" w:space="0" w:color="4BACC6" w:themeColor="accent5"/>
         <w:bottom w:val="single" w:sz="8" w:space="0" w:color="4BACC6" w:themeColor="accent5"/>
         <w:right w:val="single" w:sz="8" w:space="0" w:color="4BACC6" w:themeColor="accent5"/>
       </w:tblBorders>
-      <w:tblCellMar>
-        <w:top w:w="0" w:type="dxa"/>
-        <w:left w:w="108" w:type="dxa"/>
-        <w:bottom w:w="0" w:type="dxa"/>
-        <w:right w:w="108" w:type="dxa"/>
-      </w:tblCellMar>
     </w:tblPr>
     <w:tblStylePr w:type="firstRow">
       <w:pPr>
@@ -4388,19 +4682,12 @@
     <w:tblPr>
       <w:tblStyleRowBandSize w:val="1"/>
       <w:tblStyleColBandSize w:val="1"/>
-      <w:tblInd w:w="0" w:type="dxa"/>
       <w:tblBorders>
         <w:top w:val="single" w:sz="8" w:space="0" w:color="F79646" w:themeColor="accent6"/>
         <w:left w:val="single" w:sz="8" w:space="0" w:color="F79646" w:themeColor="accent6"/>
         <w:bottom w:val="single" w:sz="8" w:space="0" w:color="F79646" w:themeColor="accent6"/>
         <w:right w:val="single" w:sz="8" w:space="0" w:color="F79646" w:themeColor="accent6"/>
       </w:tblBorders>
-      <w:tblCellMar>
-        <w:top w:w="0" w:type="dxa"/>
-        <w:left w:w="108" w:type="dxa"/>
-        <w:bottom w:w="0" w:type="dxa"/>
-        <w:right w:w="108" w:type="dxa"/>
-      </w:tblCellMar>
     </w:tblPr>
     <w:tblStylePr w:type="firstRow">
       <w:pPr>
@@ -4480,7 +4767,6 @@
     <w:tblPr>
       <w:tblStyleRowBandSize w:val="1"/>
       <w:tblStyleColBandSize w:val="1"/>
-      <w:tblInd w:w="0" w:type="dxa"/>
       <w:tblBorders>
         <w:top w:val="single" w:sz="8" w:space="0" w:color="000000" w:themeColor="text1"/>
         <w:left w:val="single" w:sz="8" w:space="0" w:color="000000" w:themeColor="text1"/>
@@ -4489,12 +4775,6 @@
         <w:insideH w:val="single" w:sz="8" w:space="0" w:color="000000" w:themeColor="text1"/>
         <w:insideV w:val="single" w:sz="8" w:space="0" w:color="000000" w:themeColor="text1"/>
       </w:tblBorders>
-      <w:tblCellMar>
-        <w:top w:w="0" w:type="dxa"/>
-        <w:left w:w="108" w:type="dxa"/>
-        <w:bottom w:w="0" w:type="dxa"/>
-        <w:right w:w="108" w:type="dxa"/>
-      </w:tblCellMar>
     </w:tblPr>
     <w:tblStylePr w:type="firstRow">
       <w:pPr>
@@ -4610,7 +4890,6 @@
     <w:tblPr>
       <w:tblStyleRowBandSize w:val="1"/>
       <w:tblStyleColBandSize w:val="1"/>
-      <w:tblInd w:w="0" w:type="dxa"/>
       <w:tblBorders>
         <w:top w:val="single" w:sz="8" w:space="0" w:color="4F81BD" w:themeColor="accent1"/>
         <w:left w:val="single" w:sz="8" w:space="0" w:color="4F81BD" w:themeColor="accent1"/>
@@ -4619,12 +4898,6 @@
         <w:insideH w:val="single" w:sz="8" w:space="0" w:color="4F81BD" w:themeColor="accent1"/>
         <w:insideV w:val="single" w:sz="8" w:space="0" w:color="4F81BD" w:themeColor="accent1"/>
       </w:tblBorders>
-      <w:tblCellMar>
-        <w:top w:w="0" w:type="dxa"/>
-        <w:left w:w="108" w:type="dxa"/>
-        <w:bottom w:w="0" w:type="dxa"/>
-        <w:right w:w="108" w:type="dxa"/>
-      </w:tblCellMar>
     </w:tblPr>
     <w:tblStylePr w:type="firstRow">
       <w:pPr>
@@ -4740,7 +5013,6 @@
     <w:tblPr>
       <w:tblStyleRowBandSize w:val="1"/>
       <w:tblStyleColBandSize w:val="1"/>
-      <w:tblInd w:w="0" w:type="dxa"/>
       <w:tblBorders>
         <w:top w:val="single" w:sz="8" w:space="0" w:color="C0504D" w:themeColor="accent2"/>
         <w:left w:val="single" w:sz="8" w:space="0" w:color="C0504D" w:themeColor="accent2"/>
@@ -4749,12 +5021,6 @@
         <w:insideH w:val="single" w:sz="8" w:space="0" w:color="C0504D" w:themeColor="accent2"/>
         <w:insideV w:val="single" w:sz="8" w:space="0" w:color="C0504D" w:themeColor="accent2"/>
       </w:tblBorders>
-      <w:tblCellMar>
-        <w:top w:w="0" w:type="dxa"/>
-        <w:left w:w="108" w:type="dxa"/>
-        <w:bottom w:w="0" w:type="dxa"/>
-        <w:right w:w="108" w:type="dxa"/>
-      </w:tblCellMar>
     </w:tblPr>
     <w:tblStylePr w:type="firstRow">
       <w:pPr>
@@ -4870,7 +5136,6 @@
     <w:tblPr>
       <w:tblStyleRowBandSize w:val="1"/>
       <w:tblStyleColBandSize w:val="1"/>
-      <w:tblInd w:w="0" w:type="dxa"/>
       <w:tblBorders>
         <w:top w:val="single" w:sz="8" w:space="0" w:color="9BBB59" w:themeColor="accent3"/>
         <w:left w:val="single" w:sz="8" w:space="0" w:color="9BBB59" w:themeColor="accent3"/>
@@ -4879,12 +5144,6 @@
         <w:insideH w:val="single" w:sz="8" w:space="0" w:color="9BBB59" w:themeColor="accent3"/>
         <w:insideV w:val="single" w:sz="8" w:space="0" w:color="9BBB59" w:themeColor="accent3"/>
       </w:tblBorders>
-      <w:tblCellMar>
-        <w:top w:w="0" w:type="dxa"/>
-        <w:left w:w="108" w:type="dxa"/>
-        <w:bottom w:w="0" w:type="dxa"/>
-        <w:right w:w="108" w:type="dxa"/>
-      </w:tblCellMar>
     </w:tblPr>
     <w:tblStylePr w:type="firstRow">
       <w:pPr>
@@ -5000,7 +5259,6 @@
     <w:tblPr>
       <w:tblStyleRowBandSize w:val="1"/>
       <w:tblStyleColBandSize w:val="1"/>
-      <w:tblInd w:w="0" w:type="dxa"/>
       <w:tblBorders>
         <w:top w:val="single" w:sz="8" w:space="0" w:color="8064A2" w:themeColor="accent4"/>
         <w:left w:val="single" w:sz="8" w:space="0" w:color="8064A2" w:themeColor="accent4"/>
@@ -5009,12 +5267,6 @@
         <w:insideH w:val="single" w:sz="8" w:space="0" w:color="8064A2" w:themeColor="accent4"/>
         <w:insideV w:val="single" w:sz="8" w:space="0" w:color="8064A2" w:themeColor="accent4"/>
       </w:tblBorders>
-      <w:tblCellMar>
-        <w:top w:w="0" w:type="dxa"/>
-        <w:left w:w="108" w:type="dxa"/>
-        <w:bottom w:w="0" w:type="dxa"/>
-        <w:right w:w="108" w:type="dxa"/>
-      </w:tblCellMar>
     </w:tblPr>
     <w:tblStylePr w:type="firstRow">
       <w:pPr>
@@ -5130,7 +5382,6 @@
     <w:tblPr>
       <w:tblStyleRowBandSize w:val="1"/>
       <w:tblStyleColBandSize w:val="1"/>
-      <w:tblInd w:w="0" w:type="dxa"/>
       <w:tblBorders>
         <w:top w:val="single" w:sz="8" w:space="0" w:color="4BACC6" w:themeColor="accent5"/>
         <w:left w:val="single" w:sz="8" w:space="0" w:color="4BACC6" w:themeColor="accent5"/>
@@ -5139,12 +5390,6 @@
         <w:insideH w:val="single" w:sz="8" w:space="0" w:color="4BACC6" w:themeColor="accent5"/>
         <w:insideV w:val="single" w:sz="8" w:space="0" w:color="4BACC6" w:themeColor="accent5"/>
       </w:tblBorders>
-      <w:tblCellMar>
-        <w:top w:w="0" w:type="dxa"/>
-        <w:left w:w="108" w:type="dxa"/>
-        <w:bottom w:w="0" w:type="dxa"/>
-        <w:right w:w="108" w:type="dxa"/>
-      </w:tblCellMar>
     </w:tblPr>
     <w:tblStylePr w:type="firstRow">
       <w:pPr>
@@ -5260,7 +5505,6 @@
     <w:tblPr>
       <w:tblStyleRowBandSize w:val="1"/>
       <w:tblStyleColBandSize w:val="1"/>
-      <w:tblInd w:w="0" w:type="dxa"/>
       <w:tblBorders>
         <w:top w:val="single" w:sz="8" w:space="0" w:color="F79646" w:themeColor="accent6"/>
         <w:left w:val="single" w:sz="8" w:space="0" w:color="F79646" w:themeColor="accent6"/>
@@ -5269,12 +5513,6 @@
         <w:insideH w:val="single" w:sz="8" w:space="0" w:color="F79646" w:themeColor="accent6"/>
         <w:insideV w:val="single" w:sz="8" w:space="0" w:color="F79646" w:themeColor="accent6"/>
       </w:tblBorders>
-      <w:tblCellMar>
-        <w:top w:w="0" w:type="dxa"/>
-        <w:left w:w="108" w:type="dxa"/>
-        <w:bottom w:w="0" w:type="dxa"/>
-        <w:right w:w="108" w:type="dxa"/>
-      </w:tblCellMar>
     </w:tblPr>
     <w:tblStylePr w:type="firstRow">
       <w:pPr>
@@ -5390,7 +5628,6 @@
     <w:tblPr>
       <w:tblStyleRowBandSize w:val="1"/>
       <w:tblStyleColBandSize w:val="1"/>
-      <w:tblInd w:w="0" w:type="dxa"/>
       <w:tblBorders>
         <w:top w:val="single" w:sz="8" w:space="0" w:color="404040" w:themeColor="text1" w:themeTint="BF"/>
         <w:left w:val="single" w:sz="8" w:space="0" w:color="404040" w:themeColor="text1" w:themeTint="BF"/>
@@ -5398,12 +5635,6 @@
         <w:right w:val="single" w:sz="8" w:space="0" w:color="404040" w:themeColor="text1" w:themeTint="BF"/>
         <w:insideH w:val="single" w:sz="8" w:space="0" w:color="404040" w:themeColor="text1" w:themeTint="BF"/>
       </w:tblBorders>
-      <w:tblCellMar>
-        <w:top w:w="0" w:type="dxa"/>
-        <w:left w:w="108" w:type="dxa"/>
-        <w:bottom w:w="0" w:type="dxa"/>
-        <w:right w:w="108" w:type="dxa"/>
-      </w:tblCellMar>
     </w:tblPr>
     <w:tblStylePr w:type="firstRow">
       <w:pPr>
@@ -5496,7 +5727,6 @@
     <w:tblPr>
       <w:tblStyleRowBandSize w:val="1"/>
       <w:tblStyleColBandSize w:val="1"/>
-      <w:tblInd w:w="0" w:type="dxa"/>
       <w:tblBorders>
         <w:top w:val="single" w:sz="8" w:space="0" w:color="7BA0CD" w:themeColor="accent1" w:themeTint="BF"/>
         <w:left w:val="single" w:sz="8" w:space="0" w:color="7BA0CD" w:themeColor="accent1" w:themeTint="BF"/>
@@ -5504,12 +5734,6 @@
         <w:right w:val="single" w:sz="8" w:space="0" w:color="7BA0CD" w:themeColor="accent1" w:themeTint="BF"/>
         <w:insideH w:val="single" w:sz="8" w:space="0" w:color="7BA0CD" w:themeColor="accent1" w:themeTint="BF"/>
       </w:tblBorders>
-      <w:tblCellMar>
-        <w:top w:w="0" w:type="dxa"/>
-        <w:left w:w="108" w:type="dxa"/>
-        <w:bottom w:w="0" w:type="dxa"/>
-        <w:right w:w="108" w:type="dxa"/>
-      </w:tblCellMar>
     </w:tblPr>
     <w:tblStylePr w:type="firstRow">
       <w:pPr>
@@ -5602,7 +5826,6 @@
     <w:tblPr>
       <w:tblStyleRowBandSize w:val="1"/>
       <w:tblStyleColBandSize w:val="1"/>
-      <w:tblInd w:w="0" w:type="dxa"/>
       <w:tblBorders>
         <w:top w:val="single" w:sz="8" w:space="0" w:color="CF7B79" w:themeColor="accent2" w:themeTint="BF"/>
         <w:left w:val="single" w:sz="8" w:space="0" w:color="CF7B79" w:themeColor="accent2" w:themeTint="BF"/>
@@ -5610,12 +5833,6 @@
         <w:right w:val="single" w:sz="8" w:space="0" w:color="CF7B79" w:themeColor="accent2" w:themeTint="BF"/>
         <w:insideH w:val="single" w:sz="8" w:space="0" w:color="CF7B79" w:themeColor="accent2" w:themeTint="BF"/>
       </w:tblBorders>
-      <w:tblCellMar>
-        <w:top w:w="0" w:type="dxa"/>
-        <w:left w:w="108" w:type="dxa"/>
-        <w:bottom w:w="0" w:type="dxa"/>
-        <w:right w:w="108" w:type="dxa"/>
-      </w:tblCellMar>
     </w:tblPr>
     <w:tblStylePr w:type="firstRow">
       <w:pPr>
@@ -5708,7 +5925,6 @@
     <w:tblPr>
       <w:tblStyleRowBandSize w:val="1"/>
       <w:tblStyleColBandSize w:val="1"/>
-      <w:tblInd w:w="0" w:type="dxa"/>
       <w:tblBorders>
         <w:top w:val="single" w:sz="8" w:space="0" w:color="B3CC82" w:themeColor="accent3" w:themeTint="BF"/>
         <w:left w:val="single" w:sz="8" w:space="0" w:color="B3CC82" w:themeColor="accent3" w:themeTint="BF"/>
@@ -5716,12 +5932,6 @@
         <w:right w:val="single" w:sz="8" w:space="0" w:color="B3CC82" w:themeColor="accent3" w:themeTint="BF"/>
         <w:insideH w:val="single" w:sz="8" w:space="0" w:color="B3CC82" w:themeColor="accent3" w:themeTint="BF"/>
       </w:tblBorders>
-      <w:tblCellMar>
-        <w:top w:w="0" w:type="dxa"/>
-        <w:left w:w="108" w:type="dxa"/>
-        <w:bottom w:w="0" w:type="dxa"/>
-        <w:right w:w="108" w:type="dxa"/>
-      </w:tblCellMar>
     </w:tblPr>
     <w:tblStylePr w:type="firstRow">
       <w:pPr>
@@ -5814,7 +6024,6 @@
     <w:tblPr>
       <w:tblStyleRowBandSize w:val="1"/>
       <w:tblStyleColBandSize w:val="1"/>
-      <w:tblInd w:w="0" w:type="dxa"/>
       <w:tblBorders>
         <w:top w:val="single" w:sz="8" w:space="0" w:color="9F8AB9" w:themeColor="accent4" w:themeTint="BF"/>
         <w:left w:val="single" w:sz="8" w:space="0" w:color="9F8AB9" w:themeColor="accent4" w:themeTint="BF"/>
@@ -5822,12 +6031,6 @@
         <w:right w:val="single" w:sz="8" w:space="0" w:color="9F8AB9" w:themeColor="accent4" w:themeTint="BF"/>
         <w:insideH w:val="single" w:sz="8" w:space="0" w:color="9F8AB9" w:themeColor="accent4" w:themeTint="BF"/>
       </w:tblBorders>
-      <w:tblCellMar>
-        <w:top w:w="0" w:type="dxa"/>
-        <w:left w:w="108" w:type="dxa"/>
-        <w:bottom w:w="0" w:type="dxa"/>
-        <w:right w:w="108" w:type="dxa"/>
-      </w:tblCellMar>
     </w:tblPr>
     <w:tblStylePr w:type="firstRow">
       <w:pPr>
@@ -5920,7 +6123,6 @@
     <w:tblPr>
       <w:tblStyleRowBandSize w:val="1"/>
       <w:tblStyleColBandSize w:val="1"/>
-      <w:tblInd w:w="0" w:type="dxa"/>
       <w:tblBorders>
         <w:top w:val="single" w:sz="8" w:space="0" w:color="78C0D4" w:themeColor="accent5" w:themeTint="BF"/>
         <w:left w:val="single" w:sz="8" w:space="0" w:color="78C0D4" w:themeColor="accent5" w:themeTint="BF"/>
@@ -5928,12 +6130,6 @@
         <w:right w:val="single" w:sz="8" w:space="0" w:color="78C0D4" w:themeColor="accent5" w:themeTint="BF"/>
         <w:insideH w:val="single" w:sz="8" w:space="0" w:color="78C0D4" w:themeColor="accent5" w:themeTint="BF"/>
       </w:tblBorders>
-      <w:tblCellMar>
-        <w:top w:w="0" w:type="dxa"/>
-        <w:left w:w="108" w:type="dxa"/>
-        <w:bottom w:w="0" w:type="dxa"/>
-        <w:right w:w="108" w:type="dxa"/>
-      </w:tblCellMar>
     </w:tblPr>
     <w:tblStylePr w:type="firstRow">
       <w:pPr>
@@ -6026,7 +6222,6 @@
     <w:tblPr>
       <w:tblStyleRowBandSize w:val="1"/>
       <w:tblStyleColBandSize w:val="1"/>
-      <w:tblInd w:w="0" w:type="dxa"/>
       <w:tblBorders>
         <w:top w:val="single" w:sz="8" w:space="0" w:color="F9B074" w:themeColor="accent6" w:themeTint="BF"/>
         <w:left w:val="single" w:sz="8" w:space="0" w:color="F9B074" w:themeColor="accent6" w:themeTint="BF"/>
@@ -6034,12 +6229,6 @@
         <w:right w:val="single" w:sz="8" w:space="0" w:color="F9B074" w:themeColor="accent6" w:themeTint="BF"/>
         <w:insideH w:val="single" w:sz="8" w:space="0" w:color="F9B074" w:themeColor="accent6" w:themeTint="BF"/>
       </w:tblBorders>
-      <w:tblCellMar>
-        <w:top w:w="0" w:type="dxa"/>
-        <w:left w:w="108" w:type="dxa"/>
-        <w:bottom w:w="0" w:type="dxa"/>
-        <w:right w:w="108" w:type="dxa"/>
-      </w:tblCellMar>
     </w:tblPr>
     <w:tblStylePr w:type="firstRow">
       <w:pPr>
@@ -6132,17 +6321,10 @@
     <w:tblPr>
       <w:tblStyleRowBandSize w:val="1"/>
       <w:tblStyleColBandSize w:val="1"/>
-      <w:tblInd w:w="0" w:type="dxa"/>
       <w:tblBorders>
         <w:top w:val="single" w:sz="18" w:space="0" w:color="auto"/>
         <w:bottom w:val="single" w:sz="18" w:space="0" w:color="auto"/>
       </w:tblBorders>
-      <w:tblCellMar>
-        <w:top w:w="0" w:type="dxa"/>
-        <w:left w:w="108" w:type="dxa"/>
-        <w:bottom w:w="0" w:type="dxa"/>
-        <w:right w:w="108" w:type="dxa"/>
-      </w:tblCellMar>
     </w:tblPr>
     <w:tblStylePr w:type="firstRow">
       <w:pPr>
@@ -6281,17 +6463,10 @@
     <w:tblPr>
       <w:tblStyleRowBandSize w:val="1"/>
       <w:tblStyleColBandSize w:val="1"/>
-      <w:tblInd w:w="0" w:type="dxa"/>
       <w:tblBorders>
         <w:top w:val="single" w:sz="18" w:space="0" w:color="auto"/>
         <w:bottom w:val="single" w:sz="18" w:space="0" w:color="auto"/>
       </w:tblBorders>
-      <w:tblCellMar>
-        <w:top w:w="0" w:type="dxa"/>
-        <w:left w:w="108" w:type="dxa"/>
-        <w:bottom w:w="0" w:type="dxa"/>
-        <w:right w:w="108" w:type="dxa"/>
-      </w:tblCellMar>
     </w:tblPr>
     <w:tblStylePr w:type="firstRow">
       <w:pPr>
@@ -6430,17 +6605,10 @@
     <w:tblPr>
       <w:tblStyleRowBandSize w:val="1"/>
       <w:tblStyleColBandSize w:val="1"/>
-      <w:tblInd w:w="0" w:type="dxa"/>
       <w:tblBorders>
         <w:top w:val="single" w:sz="18" w:space="0" w:color="auto"/>
         <w:bottom w:val="single" w:sz="18" w:space="0" w:color="auto"/>
       </w:tblBorders>
-      <w:tblCellMar>
-        <w:top w:w="0" w:type="dxa"/>
-        <w:left w:w="108" w:type="dxa"/>
-        <w:bottom w:w="0" w:type="dxa"/>
-        <w:right w:w="108" w:type="dxa"/>
-      </w:tblCellMar>
     </w:tblPr>
     <w:tblStylePr w:type="firstRow">
       <w:pPr>
@@ -6579,17 +6747,10 @@
     <w:tblPr>
       <w:tblStyleRowBandSize w:val="1"/>
       <w:tblStyleColBandSize w:val="1"/>
-      <w:tblInd w:w="0" w:type="dxa"/>
       <w:tblBorders>
         <w:top w:val="single" w:sz="18" w:space="0" w:color="auto"/>
         <w:bottom w:val="single" w:sz="18" w:space="0" w:color="auto"/>
       </w:tblBorders>
-      <w:tblCellMar>
-        <w:top w:w="0" w:type="dxa"/>
-        <w:left w:w="108" w:type="dxa"/>
-        <w:bottom w:w="0" w:type="dxa"/>
-        <w:right w:w="108" w:type="dxa"/>
-      </w:tblCellMar>
     </w:tblPr>
     <w:tblStylePr w:type="firstRow">
       <w:pPr>
@@ -6728,17 +6889,10 @@
     <w:tblPr>
       <w:tblStyleRowBandSize w:val="1"/>
       <w:tblStyleColBandSize w:val="1"/>
-      <w:tblInd w:w="0" w:type="dxa"/>
       <w:tblBorders>
         <w:top w:val="single" w:sz="18" w:space="0" w:color="auto"/>
         <w:bottom w:val="single" w:sz="18" w:space="0" w:color="auto"/>
       </w:tblBorders>
-      <w:tblCellMar>
-        <w:top w:w="0" w:type="dxa"/>
-        <w:left w:w="108" w:type="dxa"/>
-        <w:bottom w:w="0" w:type="dxa"/>
-        <w:right w:w="108" w:type="dxa"/>
-      </w:tblCellMar>
     </w:tblPr>
     <w:tblStylePr w:type="firstRow">
       <w:pPr>
@@ -6877,17 +7031,10 @@
     <w:tblPr>
       <w:tblStyleRowBandSize w:val="1"/>
       <w:tblStyleColBandSize w:val="1"/>
-      <w:tblInd w:w="0" w:type="dxa"/>
       <w:tblBorders>
         <w:top w:val="single" w:sz="18" w:space="0" w:color="auto"/>
         <w:bottom w:val="single" w:sz="18" w:space="0" w:color="auto"/>
       </w:tblBorders>
-      <w:tblCellMar>
-        <w:top w:w="0" w:type="dxa"/>
-        <w:left w:w="108" w:type="dxa"/>
-        <w:bottom w:w="0" w:type="dxa"/>
-        <w:right w:w="108" w:type="dxa"/>
-      </w:tblCellMar>
     </w:tblPr>
     <w:tblStylePr w:type="firstRow">
       <w:pPr>
@@ -7026,17 +7173,10 @@
     <w:tblPr>
       <w:tblStyleRowBandSize w:val="1"/>
       <w:tblStyleColBandSize w:val="1"/>
-      <w:tblInd w:w="0" w:type="dxa"/>
       <w:tblBorders>
         <w:top w:val="single" w:sz="18" w:space="0" w:color="auto"/>
         <w:bottom w:val="single" w:sz="18" w:space="0" w:color="auto"/>
       </w:tblBorders>
-      <w:tblCellMar>
-        <w:top w:w="0" w:type="dxa"/>
-        <w:left w:w="108" w:type="dxa"/>
-        <w:bottom w:w="0" w:type="dxa"/>
-        <w:right w:w="108" w:type="dxa"/>
-      </w:tblCellMar>
     </w:tblPr>
     <w:tblStylePr w:type="firstRow">
       <w:pPr>
@@ -7178,17 +7318,10 @@
     <w:tblPr>
       <w:tblStyleRowBandSize w:val="1"/>
       <w:tblStyleColBandSize w:val="1"/>
-      <w:tblInd w:w="0" w:type="dxa"/>
       <w:tblBorders>
         <w:top w:val="single" w:sz="8" w:space="0" w:color="000000" w:themeColor="text1"/>
         <w:bottom w:val="single" w:sz="8" w:space="0" w:color="000000" w:themeColor="text1"/>
       </w:tblBorders>
-      <w:tblCellMar>
-        <w:top w:w="0" w:type="dxa"/>
-        <w:left w:w="108" w:type="dxa"/>
-        <w:bottom w:w="0" w:type="dxa"/>
-        <w:right w:w="108" w:type="dxa"/>
-      </w:tblCellMar>
     </w:tblPr>
     <w:tblStylePr w:type="firstRow">
       <w:rPr>
@@ -7262,17 +7395,10 @@
     <w:tblPr>
       <w:tblStyleRowBandSize w:val="1"/>
       <w:tblStyleColBandSize w:val="1"/>
-      <w:tblInd w:w="0" w:type="dxa"/>
       <w:tblBorders>
         <w:top w:val="single" w:sz="8" w:space="0" w:color="4F81BD" w:themeColor="accent1"/>
         <w:bottom w:val="single" w:sz="8" w:space="0" w:color="4F81BD" w:themeColor="accent1"/>
       </w:tblBorders>
-      <w:tblCellMar>
-        <w:top w:w="0" w:type="dxa"/>
-        <w:left w:w="108" w:type="dxa"/>
-        <w:bottom w:w="0" w:type="dxa"/>
-        <w:right w:w="108" w:type="dxa"/>
-      </w:tblCellMar>
     </w:tblPr>
     <w:tblStylePr w:type="firstRow">
       <w:rPr>
@@ -7346,17 +7472,10 @@
     <w:tblPr>
       <w:tblStyleRowBandSize w:val="1"/>
       <w:tblStyleColBandSize w:val="1"/>
-      <w:tblInd w:w="0" w:type="dxa"/>
       <w:tblBorders>
         <w:top w:val="single" w:sz="8" w:space="0" w:color="C0504D" w:themeColor="accent2"/>
         <w:bottom w:val="single" w:sz="8" w:space="0" w:color="C0504D" w:themeColor="accent2"/>
       </w:tblBorders>
-      <w:tblCellMar>
-        <w:top w:w="0" w:type="dxa"/>
-        <w:left w:w="108" w:type="dxa"/>
-        <w:bottom w:w="0" w:type="dxa"/>
-        <w:right w:w="108" w:type="dxa"/>
-      </w:tblCellMar>
     </w:tblPr>
     <w:tblStylePr w:type="firstRow">
       <w:rPr>
@@ -7430,17 +7549,10 @@
     <w:tblPr>
       <w:tblStyleRowBandSize w:val="1"/>
       <w:tblStyleColBandSize w:val="1"/>
-      <w:tblInd w:w="0" w:type="dxa"/>
       <w:tblBorders>
         <w:top w:val="single" w:sz="8" w:space="0" w:color="9BBB59" w:themeColor="accent3"/>
         <w:bottom w:val="single" w:sz="8" w:space="0" w:color="9BBB59" w:themeColor="accent3"/>
       </w:tblBorders>
-      <w:tblCellMar>
-        <w:top w:w="0" w:type="dxa"/>
-        <w:left w:w="108" w:type="dxa"/>
-        <w:bottom w:w="0" w:type="dxa"/>
-        <w:right w:w="108" w:type="dxa"/>
-      </w:tblCellMar>
     </w:tblPr>
     <w:tblStylePr w:type="firstRow">
       <w:rPr>
@@ -7514,17 +7626,10 @@
     <w:tblPr>
       <w:tblStyleRowBandSize w:val="1"/>
       <w:tblStyleColBandSize w:val="1"/>
-      <w:tblInd w:w="0" w:type="dxa"/>
       <w:tblBorders>
         <w:top w:val="single" w:sz="8" w:space="0" w:color="8064A2" w:themeColor="accent4"/>
         <w:bottom w:val="single" w:sz="8" w:space="0" w:color="8064A2" w:themeColor="accent4"/>
       </w:tblBorders>
-      <w:tblCellMar>
-        <w:top w:w="0" w:type="dxa"/>
-        <w:left w:w="108" w:type="dxa"/>
-        <w:bottom w:w="0" w:type="dxa"/>
-        <w:right w:w="108" w:type="dxa"/>
-      </w:tblCellMar>
     </w:tblPr>
     <w:tblStylePr w:type="firstRow">
       <w:rPr>
@@ -7598,17 +7703,10 @@
     <w:tblPr>
       <w:tblStyleRowBandSize w:val="1"/>
       <w:tblStyleColBandSize w:val="1"/>
-      <w:tblInd w:w="0" w:type="dxa"/>
       <w:tblBorders>
         <w:top w:val="single" w:sz="8" w:space="0" w:color="4BACC6" w:themeColor="accent5"/>
         <w:bottom w:val="single" w:sz="8" w:space="0" w:color="4BACC6" w:themeColor="accent5"/>
       </w:tblBorders>
-      <w:tblCellMar>
-        <w:top w:w="0" w:type="dxa"/>
-        <w:left w:w="108" w:type="dxa"/>
-        <w:bottom w:w="0" w:type="dxa"/>
-        <w:right w:w="108" w:type="dxa"/>
-      </w:tblCellMar>
     </w:tblPr>
     <w:tblStylePr w:type="firstRow">
       <w:rPr>
@@ -7682,17 +7780,10 @@
     <w:tblPr>
       <w:tblStyleRowBandSize w:val="1"/>
       <w:tblStyleColBandSize w:val="1"/>
-      <w:tblInd w:w="0" w:type="dxa"/>
       <w:tblBorders>
         <w:top w:val="single" w:sz="8" w:space="0" w:color="F79646" w:themeColor="accent6"/>
         <w:bottom w:val="single" w:sz="8" w:space="0" w:color="F79646" w:themeColor="accent6"/>
       </w:tblBorders>
-      <w:tblCellMar>
-        <w:top w:w="0" w:type="dxa"/>
-        <w:left w:w="108" w:type="dxa"/>
-        <w:bottom w:w="0" w:type="dxa"/>
-        <w:right w:w="108" w:type="dxa"/>
-      </w:tblCellMar>
     </w:tblPr>
     <w:tblStylePr w:type="firstRow">
       <w:rPr>
@@ -7767,19 +7858,12 @@
     <w:tblPr>
       <w:tblStyleRowBandSize w:val="1"/>
       <w:tblStyleColBandSize w:val="1"/>
-      <w:tblInd w:w="0" w:type="dxa"/>
       <w:tblBorders>
         <w:top w:val="single" w:sz="8" w:space="0" w:color="000000" w:themeColor="text1"/>
         <w:left w:val="single" w:sz="8" w:space="0" w:color="000000" w:themeColor="text1"/>
         <w:bottom w:val="single" w:sz="8" w:space="0" w:color="000000" w:themeColor="text1"/>
         <w:right w:val="single" w:sz="8" w:space="0" w:color="000000" w:themeColor="text1"/>
       </w:tblBorders>
-      <w:tblCellMar>
-        <w:top w:w="0" w:type="dxa"/>
-        <w:left w:w="108" w:type="dxa"/>
-        <w:bottom w:w="0" w:type="dxa"/>
-        <w:right w:w="108" w:type="dxa"/>
-      </w:tblCellMar>
     </w:tblPr>
     <w:tblStylePr w:type="firstRow">
       <w:rPr>
@@ -7895,19 +7979,12 @@
     <w:tblPr>
       <w:tblStyleRowBandSize w:val="1"/>
       <w:tblStyleColBandSize w:val="1"/>
-      <w:tblInd w:w="0" w:type="dxa"/>
       <w:tblBorders>
         <w:top w:val="single" w:sz="8" w:space="0" w:color="4F81BD" w:themeColor="accent1"/>
         <w:left w:val="single" w:sz="8" w:space="0" w:color="4F81BD" w:themeColor="accent1"/>
         <w:bottom w:val="single" w:sz="8" w:space="0" w:color="4F81BD" w:themeColor="accent1"/>
         <w:right w:val="single" w:sz="8" w:space="0" w:color="4F81BD" w:themeColor="accent1"/>
       </w:tblBorders>
-      <w:tblCellMar>
-        <w:top w:w="0" w:type="dxa"/>
-        <w:left w:w="108" w:type="dxa"/>
-        <w:bottom w:w="0" w:type="dxa"/>
-        <w:right w:w="108" w:type="dxa"/>
-      </w:tblCellMar>
     </w:tblPr>
     <w:tblStylePr w:type="firstRow">
       <w:rPr>
@@ -8023,19 +8100,12 @@
     <w:tblPr>
       <w:tblStyleRowBandSize w:val="1"/>
       <w:tblStyleColBandSize w:val="1"/>
-      <w:tblInd w:w="0" w:type="dxa"/>
       <w:tblBorders>
         <w:top w:val="single" w:sz="8" w:space="0" w:color="C0504D" w:themeColor="accent2"/>
         <w:left w:val="single" w:sz="8" w:space="0" w:color="C0504D" w:themeColor="accent2"/>
         <w:bottom w:val="single" w:sz="8" w:space="0" w:color="C0504D" w:themeColor="accent2"/>
         <w:right w:val="single" w:sz="8" w:space="0" w:color="C0504D" w:themeColor="accent2"/>
       </w:tblBorders>
-      <w:tblCellMar>
-        <w:top w:w="0" w:type="dxa"/>
-        <w:left w:w="108" w:type="dxa"/>
-        <w:bottom w:w="0" w:type="dxa"/>
-        <w:right w:w="108" w:type="dxa"/>
-      </w:tblCellMar>
     </w:tblPr>
     <w:tblStylePr w:type="firstRow">
       <w:rPr>
@@ -8151,19 +8221,12 @@
     <w:tblPr>
       <w:tblStyleRowBandSize w:val="1"/>
       <w:tblStyleColBandSize w:val="1"/>
-      <w:tblInd w:w="0" w:type="dxa"/>
       <w:tblBorders>
         <w:top w:val="single" w:sz="8" w:space="0" w:color="9BBB59" w:themeColor="accent3"/>
         <w:left w:val="single" w:sz="8" w:space="0" w:color="9BBB59" w:themeColor="accent3"/>
         <w:bottom w:val="single" w:sz="8" w:space="0" w:color="9BBB59" w:themeColor="accent3"/>
         <w:right w:val="single" w:sz="8" w:space="0" w:color="9BBB59" w:themeColor="accent3"/>
       </w:tblBorders>
-      <w:tblCellMar>
-        <w:top w:w="0" w:type="dxa"/>
-        <w:left w:w="108" w:type="dxa"/>
-        <w:bottom w:w="0" w:type="dxa"/>
-        <w:right w:w="108" w:type="dxa"/>
-      </w:tblCellMar>
     </w:tblPr>
     <w:tblStylePr w:type="firstRow">
       <w:rPr>
@@ -8279,19 +8342,12 @@
     <w:tblPr>
       <w:tblStyleRowBandSize w:val="1"/>
       <w:tblStyleColBandSize w:val="1"/>
-      <w:tblInd w:w="0" w:type="dxa"/>
       <w:tblBorders>
         <w:top w:val="single" w:sz="8" w:space="0" w:color="8064A2" w:themeColor="accent4"/>
         <w:left w:val="single" w:sz="8" w:space="0" w:color="8064A2" w:themeColor="accent4"/>
         <w:bottom w:val="single" w:sz="8" w:space="0" w:color="8064A2" w:themeColor="accent4"/>
         <w:right w:val="single" w:sz="8" w:space="0" w:color="8064A2" w:themeColor="accent4"/>
       </w:tblBorders>
-      <w:tblCellMar>
-        <w:top w:w="0" w:type="dxa"/>
-        <w:left w:w="108" w:type="dxa"/>
-        <w:bottom w:w="0" w:type="dxa"/>
-        <w:right w:w="108" w:type="dxa"/>
-      </w:tblCellMar>
     </w:tblPr>
     <w:tblStylePr w:type="firstRow">
       <w:rPr>
@@ -8407,19 +8463,12 @@
     <w:tblPr>
       <w:tblStyleRowBandSize w:val="1"/>
       <w:tblStyleColBandSize w:val="1"/>
-      <w:tblInd w:w="0" w:type="dxa"/>
       <w:tblBorders>
         <w:top w:val="single" w:sz="8" w:space="0" w:color="4BACC6" w:themeColor="accent5"/>
         <w:left w:val="single" w:sz="8" w:space="0" w:color="4BACC6" w:themeColor="accent5"/>
         <w:bottom w:val="single" w:sz="8" w:space="0" w:color="4BACC6" w:themeColor="accent5"/>
         <w:right w:val="single" w:sz="8" w:space="0" w:color="4BACC6" w:themeColor="accent5"/>
       </w:tblBorders>
-      <w:tblCellMar>
-        <w:top w:w="0" w:type="dxa"/>
-        <w:left w:w="108" w:type="dxa"/>
-        <w:bottom w:w="0" w:type="dxa"/>
-        <w:right w:w="108" w:type="dxa"/>
-      </w:tblCellMar>
     </w:tblPr>
     <w:tblStylePr w:type="firstRow">
       <w:rPr>
@@ -8535,19 +8584,12 @@
     <w:tblPr>
       <w:tblStyleRowBandSize w:val="1"/>
       <w:tblStyleColBandSize w:val="1"/>
-      <w:tblInd w:w="0" w:type="dxa"/>
       <w:tblBorders>
         <w:top w:val="single" w:sz="8" w:space="0" w:color="F79646" w:themeColor="accent6"/>
         <w:left w:val="single" w:sz="8" w:space="0" w:color="F79646" w:themeColor="accent6"/>
         <w:bottom w:val="single" w:sz="8" w:space="0" w:color="F79646" w:themeColor="accent6"/>
         <w:right w:val="single" w:sz="8" w:space="0" w:color="F79646" w:themeColor="accent6"/>
       </w:tblBorders>
-      <w:tblCellMar>
-        <w:top w:w="0" w:type="dxa"/>
-        <w:left w:w="108" w:type="dxa"/>
-        <w:bottom w:w="0" w:type="dxa"/>
-        <w:right w:w="108" w:type="dxa"/>
-      </w:tblCellMar>
     </w:tblPr>
     <w:tblStylePr w:type="firstRow">
       <w:rPr>
@@ -8659,7 +8701,6 @@
     <w:tblPr>
       <w:tblStyleRowBandSize w:val="1"/>
       <w:tblStyleColBandSize w:val="1"/>
-      <w:tblInd w:w="0" w:type="dxa"/>
       <w:tblBorders>
         <w:top w:val="single" w:sz="8" w:space="0" w:color="404040" w:themeColor="text1" w:themeTint="BF"/>
         <w:left w:val="single" w:sz="8" w:space="0" w:color="404040" w:themeColor="text1" w:themeTint="BF"/>
@@ -8668,12 +8709,6 @@
         <w:insideH w:val="single" w:sz="8" w:space="0" w:color="404040" w:themeColor="text1" w:themeTint="BF"/>
         <w:insideV w:val="single" w:sz="8" w:space="0" w:color="404040" w:themeColor="text1" w:themeTint="BF"/>
       </w:tblBorders>
-      <w:tblCellMar>
-        <w:top w:w="0" w:type="dxa"/>
-        <w:left w:w="108" w:type="dxa"/>
-        <w:bottom w:w="0" w:type="dxa"/>
-        <w:right w:w="108" w:type="dxa"/>
-      </w:tblCellMar>
     </w:tblPr>
     <w:tcPr>
       <w:shd w:val="clear" w:color="auto" w:fill="C0C0C0" w:themeFill="text1" w:themeFillTint="3F"/>
@@ -8732,7 +8767,6 @@
     <w:tblPr>
       <w:tblStyleRowBandSize w:val="1"/>
       <w:tblStyleColBandSize w:val="1"/>
-      <w:tblInd w:w="0" w:type="dxa"/>
       <w:tblBorders>
         <w:top w:val="single" w:sz="8" w:space="0" w:color="7BA0CD" w:themeColor="accent1" w:themeTint="BF"/>
         <w:left w:val="single" w:sz="8" w:space="0" w:color="7BA0CD" w:themeColor="accent1" w:themeTint="BF"/>
@@ -8741,12 +8775,6 @@
         <w:insideH w:val="single" w:sz="8" w:space="0" w:color="7BA0CD" w:themeColor="accent1" w:themeTint="BF"/>
         <w:insideV w:val="single" w:sz="8" w:space="0" w:color="7BA0CD" w:themeColor="accent1" w:themeTint="BF"/>
       </w:tblBorders>
-      <w:tblCellMar>
-        <w:top w:w="0" w:type="dxa"/>
-        <w:left w:w="108" w:type="dxa"/>
-        <w:bottom w:w="0" w:type="dxa"/>
-        <w:right w:w="108" w:type="dxa"/>
-      </w:tblCellMar>
     </w:tblPr>
     <w:tcPr>
       <w:shd w:val="clear" w:color="auto" w:fill="D3DFEE" w:themeFill="accent1" w:themeFillTint="3F"/>
@@ -8805,7 +8833,6 @@
     <w:tblPr>
       <w:tblStyleRowBandSize w:val="1"/>
       <w:tblStyleColBandSize w:val="1"/>
-      <w:tblInd w:w="0" w:type="dxa"/>
       <w:tblBorders>
         <w:top w:val="single" w:sz="8" w:space="0" w:color="CF7B79" w:themeColor="accent2" w:themeTint="BF"/>
         <w:left w:val="single" w:sz="8" w:space="0" w:color="CF7B79" w:themeColor="accent2" w:themeTint="BF"/>
@@ -8814,12 +8841,6 @@
         <w:insideH w:val="single" w:sz="8" w:space="0" w:color="CF7B79" w:themeColor="accent2" w:themeTint="BF"/>
         <w:insideV w:val="single" w:sz="8" w:space="0" w:color="CF7B79" w:themeColor="accent2" w:themeTint="BF"/>
       </w:tblBorders>
-      <w:tblCellMar>
-        <w:top w:w="0" w:type="dxa"/>
-        <w:left w:w="108" w:type="dxa"/>
-        <w:bottom w:w="0" w:type="dxa"/>
-        <w:right w:w="108" w:type="dxa"/>
-      </w:tblCellMar>
     </w:tblPr>
     <w:tcPr>
       <w:shd w:val="clear" w:color="auto" w:fill="EFD3D2" w:themeFill="accent2" w:themeFillTint="3F"/>
@@ -8878,7 +8899,6 @@
     <w:tblPr>
       <w:tblStyleRowBandSize w:val="1"/>
       <w:tblStyleColBandSize w:val="1"/>
-      <w:tblInd w:w="0" w:type="dxa"/>
       <w:tblBorders>
         <w:top w:val="single" w:sz="8" w:space="0" w:color="B3CC82" w:themeColor="accent3" w:themeTint="BF"/>
         <w:left w:val="single" w:sz="8" w:space="0" w:color="B3CC82" w:themeColor="accent3" w:themeTint="BF"/>
@@ -8887,12 +8907,6 @@
         <w:insideH w:val="single" w:sz="8" w:space="0" w:color="B3CC82" w:themeColor="accent3" w:themeTint="BF"/>
         <w:insideV w:val="single" w:sz="8" w:space="0" w:color="B3CC82" w:themeColor="accent3" w:themeTint="BF"/>
       </w:tblBorders>
-      <w:tblCellMar>
-        <w:top w:w="0" w:type="dxa"/>
-        <w:left w:w="108" w:type="dxa"/>
-        <w:bottom w:w="0" w:type="dxa"/>
-        <w:right w:w="108" w:type="dxa"/>
-      </w:tblCellMar>
     </w:tblPr>
     <w:tcPr>
       <w:shd w:val="clear" w:color="auto" w:fill="E6EED5" w:themeFill="accent3" w:themeFillTint="3F"/>
@@ -8951,7 +8965,6 @@
     <w:tblPr>
       <w:tblStyleRowBandSize w:val="1"/>
       <w:tblStyleColBandSize w:val="1"/>
-      <w:tblInd w:w="0" w:type="dxa"/>
       <w:tblBorders>
         <w:top w:val="single" w:sz="8" w:space="0" w:color="9F8AB9" w:themeColor="accent4" w:themeTint="BF"/>
         <w:left w:val="single" w:sz="8" w:space="0" w:color="9F8AB9" w:themeColor="accent4" w:themeTint="BF"/>
@@ -8960,12 +8973,6 @@
         <w:insideH w:val="single" w:sz="8" w:space="0" w:color="9F8AB9" w:themeColor="accent4" w:themeTint="BF"/>
         <w:insideV w:val="single" w:sz="8" w:space="0" w:color="9F8AB9" w:themeColor="accent4" w:themeTint="BF"/>
       </w:tblBorders>
-      <w:tblCellMar>
-        <w:top w:w="0" w:type="dxa"/>
-        <w:left w:w="108" w:type="dxa"/>
-        <w:bottom w:w="0" w:type="dxa"/>
-        <w:right w:w="108" w:type="dxa"/>
-      </w:tblCellMar>
     </w:tblPr>
     <w:tcPr>
       <w:shd w:val="clear" w:color="auto" w:fill="DFD8E8" w:themeFill="accent4" w:themeFillTint="3F"/>
@@ -9024,7 +9031,6 @@
     <w:tblPr>
       <w:tblStyleRowBandSize w:val="1"/>
       <w:tblStyleColBandSize w:val="1"/>
-      <w:tblInd w:w="0" w:type="dxa"/>
       <w:tblBorders>
         <w:top w:val="single" w:sz="8" w:space="0" w:color="78C0D4" w:themeColor="accent5" w:themeTint="BF"/>
         <w:left w:val="single" w:sz="8" w:space="0" w:color="78C0D4" w:themeColor="accent5" w:themeTint="BF"/>
@@ -9033,12 +9039,6 @@
         <w:insideH w:val="single" w:sz="8" w:space="0" w:color="78C0D4" w:themeColor="accent5" w:themeTint="BF"/>
         <w:insideV w:val="single" w:sz="8" w:space="0" w:color="78C0D4" w:themeColor="accent5" w:themeTint="BF"/>
       </w:tblBorders>
-      <w:tblCellMar>
-        <w:top w:w="0" w:type="dxa"/>
-        <w:left w:w="108" w:type="dxa"/>
-        <w:bottom w:w="0" w:type="dxa"/>
-        <w:right w:w="108" w:type="dxa"/>
-      </w:tblCellMar>
     </w:tblPr>
     <w:tcPr>
       <w:shd w:val="clear" w:color="auto" w:fill="D2EAF1" w:themeFill="accent5" w:themeFillTint="3F"/>
@@ -9097,7 +9097,6 @@
     <w:tblPr>
       <w:tblStyleRowBandSize w:val="1"/>
       <w:tblStyleColBandSize w:val="1"/>
-      <w:tblInd w:w="0" w:type="dxa"/>
       <w:tblBorders>
         <w:top w:val="single" w:sz="8" w:space="0" w:color="F9B074" w:themeColor="accent6" w:themeTint="BF"/>
         <w:left w:val="single" w:sz="8" w:space="0" w:color="F9B074" w:themeColor="accent6" w:themeTint="BF"/>
@@ -9106,12 +9105,6 @@
         <w:insideH w:val="single" w:sz="8" w:space="0" w:color="F9B074" w:themeColor="accent6" w:themeTint="BF"/>
         <w:insideV w:val="single" w:sz="8" w:space="0" w:color="F9B074" w:themeColor="accent6" w:themeTint="BF"/>
       </w:tblBorders>
-      <w:tblCellMar>
-        <w:top w:w="0" w:type="dxa"/>
-        <w:left w:w="108" w:type="dxa"/>
-        <w:bottom w:w="0" w:type="dxa"/>
-        <w:right w:w="108" w:type="dxa"/>
-      </w:tblCellMar>
     </w:tblPr>
     <w:tcPr>
       <w:shd w:val="clear" w:color="auto" w:fill="FDE4D0" w:themeFill="accent6" w:themeFillTint="3F"/>
@@ -9174,7 +9167,6 @@
     <w:tblPr>
       <w:tblStyleRowBandSize w:val="1"/>
       <w:tblStyleColBandSize w:val="1"/>
-      <w:tblInd w:w="0" w:type="dxa"/>
       <w:tblBorders>
         <w:top w:val="single" w:sz="8" w:space="0" w:color="000000" w:themeColor="text1"/>
         <w:left w:val="single" w:sz="8" w:space="0" w:color="000000" w:themeColor="text1"/>
@@ -9183,12 +9175,6 @@
         <w:insideH w:val="single" w:sz="8" w:space="0" w:color="000000" w:themeColor="text1"/>
         <w:insideV w:val="single" w:sz="8" w:space="0" w:color="000000" w:themeColor="text1"/>
       </w:tblBorders>
-      <w:tblCellMar>
-        <w:top w:w="0" w:type="dxa"/>
-        <w:left w:w="108" w:type="dxa"/>
-        <w:bottom w:w="0" w:type="dxa"/>
-        <w:right w:w="108" w:type="dxa"/>
-      </w:tblCellMar>
     </w:tblPr>
     <w:tcPr>
       <w:shd w:val="clear" w:color="auto" w:fill="C0C0C0" w:themeFill="text1" w:themeFillTint="3F"/>
@@ -9299,7 +9285,6 @@
     <w:tblPr>
       <w:tblStyleRowBandSize w:val="1"/>
       <w:tblStyleColBandSize w:val="1"/>
-      <w:tblInd w:w="0" w:type="dxa"/>
       <w:tblBorders>
         <w:top w:val="single" w:sz="8" w:space="0" w:color="4F81BD" w:themeColor="accent1"/>
         <w:left w:val="single" w:sz="8" w:space="0" w:color="4F81BD" w:themeColor="accent1"/>
@@ -9308,12 +9293,6 @@
         <w:insideH w:val="single" w:sz="8" w:space="0" w:color="4F81BD" w:themeColor="accent1"/>
         <w:insideV w:val="single" w:sz="8" w:space="0" w:color="4F81BD" w:themeColor="accent1"/>
       </w:tblBorders>
-      <w:tblCellMar>
-        <w:top w:w="0" w:type="dxa"/>
-        <w:left w:w="108" w:type="dxa"/>
-        <w:bottom w:w="0" w:type="dxa"/>
-        <w:right w:w="108" w:type="dxa"/>
-      </w:tblCellMar>
     </w:tblPr>
     <w:tcPr>
       <w:shd w:val="clear" w:color="auto" w:fill="D3DFEE" w:themeFill="accent1" w:themeFillTint="3F"/>
@@ -9424,7 +9403,6 @@
     <w:tblPr>
       <w:tblStyleRowBandSize w:val="1"/>
       <w:tblStyleColBandSize w:val="1"/>
-      <w:tblInd w:w="0" w:type="dxa"/>
       <w:tblBorders>
         <w:top w:val="single" w:sz="8" w:space="0" w:color="C0504D" w:themeColor="accent2"/>
         <w:left w:val="single" w:sz="8" w:space="0" w:color="C0504D" w:themeColor="accent2"/>
@@ -9433,12 +9411,6 @@
         <w:insideH w:val="single" w:sz="8" w:space="0" w:color="C0504D" w:themeColor="accent2"/>
         <w:insideV w:val="single" w:sz="8" w:space="0" w:color="C0504D" w:themeColor="accent2"/>
       </w:tblBorders>
-      <w:tblCellMar>
-        <w:top w:w="0" w:type="dxa"/>
-        <w:left w:w="108" w:type="dxa"/>
-        <w:bottom w:w="0" w:type="dxa"/>
-        <w:right w:w="108" w:type="dxa"/>
-      </w:tblCellMar>
     </w:tblPr>
     <w:tcPr>
       <w:shd w:val="clear" w:color="auto" w:fill="EFD3D2" w:themeFill="accent2" w:themeFillTint="3F"/>
@@ -9549,7 +9521,6 @@
     <w:tblPr>
       <w:tblStyleRowBandSize w:val="1"/>
       <w:tblStyleColBandSize w:val="1"/>
-      <w:tblInd w:w="0" w:type="dxa"/>
       <w:tblBorders>
         <w:top w:val="single" w:sz="8" w:space="0" w:color="9BBB59" w:themeColor="accent3"/>
         <w:left w:val="single" w:sz="8" w:space="0" w:color="9BBB59" w:themeColor="accent3"/>
@@ -9558,12 +9529,6 @@
         <w:insideH w:val="single" w:sz="8" w:space="0" w:color="9BBB59" w:themeColor="accent3"/>
         <w:insideV w:val="single" w:sz="8" w:space="0" w:color="9BBB59" w:themeColor="accent3"/>
       </w:tblBorders>
-      <w:tblCellMar>
-        <w:top w:w="0" w:type="dxa"/>
-        <w:left w:w="108" w:type="dxa"/>
-        <w:bottom w:w="0" w:type="dxa"/>
-        <w:right w:w="108" w:type="dxa"/>
-      </w:tblCellMar>
     </w:tblPr>
     <w:tcPr>
       <w:shd w:val="clear" w:color="auto" w:fill="E6EED5" w:themeFill="accent3" w:themeFillTint="3F"/>
@@ -9674,7 +9639,6 @@
     <w:tblPr>
       <w:tblStyleRowBandSize w:val="1"/>
       <w:tblStyleColBandSize w:val="1"/>
-      <w:tblInd w:w="0" w:type="dxa"/>
       <w:tblBorders>
         <w:top w:val="single" w:sz="8" w:space="0" w:color="8064A2" w:themeColor="accent4"/>
         <w:left w:val="single" w:sz="8" w:space="0" w:color="8064A2" w:themeColor="accent4"/>
@@ -9683,12 +9647,6 @@
         <w:insideH w:val="single" w:sz="8" w:space="0" w:color="8064A2" w:themeColor="accent4"/>
         <w:insideV w:val="single" w:sz="8" w:space="0" w:color="8064A2" w:themeColor="accent4"/>
       </w:tblBorders>
-      <w:tblCellMar>
-        <w:top w:w="0" w:type="dxa"/>
-        <w:left w:w="108" w:type="dxa"/>
-        <w:bottom w:w="0" w:type="dxa"/>
-        <w:right w:w="108" w:type="dxa"/>
-      </w:tblCellMar>
     </w:tblPr>
     <w:tcPr>
       <w:shd w:val="clear" w:color="auto" w:fill="DFD8E8" w:themeFill="accent4" w:themeFillTint="3F"/>
@@ -9799,7 +9757,6 @@
     <w:tblPr>
       <w:tblStyleRowBandSize w:val="1"/>
       <w:tblStyleColBandSize w:val="1"/>
-      <w:tblInd w:w="0" w:type="dxa"/>
       <w:tblBorders>
         <w:top w:val="single" w:sz="8" w:space="0" w:color="4BACC6" w:themeColor="accent5"/>
         <w:left w:val="single" w:sz="8" w:space="0" w:color="4BACC6" w:themeColor="accent5"/>
@@ -9808,12 +9765,6 @@
         <w:insideH w:val="single" w:sz="8" w:space="0" w:color="4BACC6" w:themeColor="accent5"/>
         <w:insideV w:val="single" w:sz="8" w:space="0" w:color="4BACC6" w:themeColor="accent5"/>
       </w:tblBorders>
-      <w:tblCellMar>
-        <w:top w:w="0" w:type="dxa"/>
-        <w:left w:w="108" w:type="dxa"/>
-        <w:bottom w:w="0" w:type="dxa"/>
-        <w:right w:w="108" w:type="dxa"/>
-      </w:tblCellMar>
     </w:tblPr>
     <w:tcPr>
       <w:shd w:val="clear" w:color="auto" w:fill="D2EAF1" w:themeFill="accent5" w:themeFillTint="3F"/>
@@ -9924,7 +9875,6 @@
     <w:tblPr>
       <w:tblStyleRowBandSize w:val="1"/>
       <w:tblStyleColBandSize w:val="1"/>
-      <w:tblInd w:w="0" w:type="dxa"/>
       <w:tblBorders>
         <w:top w:val="single" w:sz="8" w:space="0" w:color="F79646" w:themeColor="accent6"/>
         <w:left w:val="single" w:sz="8" w:space="0" w:color="F79646" w:themeColor="accent6"/>
@@ -9933,12 +9883,6 @@
         <w:insideH w:val="single" w:sz="8" w:space="0" w:color="F79646" w:themeColor="accent6"/>
         <w:insideV w:val="single" w:sz="8" w:space="0" w:color="F79646" w:themeColor="accent6"/>
       </w:tblBorders>
-      <w:tblCellMar>
-        <w:top w:w="0" w:type="dxa"/>
-        <w:left w:w="108" w:type="dxa"/>
-        <w:bottom w:w="0" w:type="dxa"/>
-        <w:right w:w="108" w:type="dxa"/>
-      </w:tblCellMar>
     </w:tblPr>
     <w:tcPr>
       <w:shd w:val="clear" w:color="auto" w:fill="FDE4D0" w:themeFill="accent6" w:themeFillTint="3F"/>
@@ -10045,7 +9989,6 @@
     <w:tblPr>
       <w:tblStyleRowBandSize w:val="1"/>
       <w:tblStyleColBandSize w:val="1"/>
-      <w:tblInd w:w="0" w:type="dxa"/>
       <w:tblBorders>
         <w:top w:val="single" w:sz="8" w:space="0" w:color="FFFFFF" w:themeColor="background1"/>
         <w:left w:val="single" w:sz="8" w:space="0" w:color="FFFFFF" w:themeColor="background1"/>
@@ -10054,12 +9997,6 @@
         <w:insideH w:val="single" w:sz="6" w:space="0" w:color="FFFFFF" w:themeColor="background1"/>
         <w:insideV w:val="single" w:sz="6" w:space="0" w:color="FFFFFF" w:themeColor="background1"/>
       </w:tblBorders>
-      <w:tblCellMar>
-        <w:top w:w="0" w:type="dxa"/>
-        <w:left w:w="108" w:type="dxa"/>
-        <w:bottom w:w="0" w:type="dxa"/>
-        <w:right w:w="108" w:type="dxa"/>
-      </w:tblCellMar>
     </w:tblPr>
     <w:tcPr>
       <w:shd w:val="clear" w:color="auto" w:fill="C0C0C0" w:themeFill="text1" w:themeFillTint="3F"/>
@@ -10186,7 +10123,6 @@
     <w:tblPr>
       <w:tblStyleRowBandSize w:val="1"/>
       <w:tblStyleColBandSize w:val="1"/>
-      <w:tblInd w:w="0" w:type="dxa"/>
       <w:tblBorders>
         <w:top w:val="single" w:sz="8" w:space="0" w:color="FFFFFF" w:themeColor="background1"/>
         <w:left w:val="single" w:sz="8" w:space="0" w:color="FFFFFF" w:themeColor="background1"/>
@@ -10195,12 +10131,6 @@
         <w:insideH w:val="single" w:sz="6" w:space="0" w:color="FFFFFF" w:themeColor="background1"/>
         <w:insideV w:val="single" w:sz="6" w:space="0" w:color="FFFFFF" w:themeColor="background1"/>
       </w:tblBorders>
-      <w:tblCellMar>
-        <w:top w:w="0" w:type="dxa"/>
-        <w:left w:w="108" w:type="dxa"/>
-        <w:bottom w:w="0" w:type="dxa"/>
-        <w:right w:w="108" w:type="dxa"/>
-      </w:tblCellMar>
     </w:tblPr>
     <w:tcPr>
       <w:shd w:val="clear" w:color="auto" w:fill="D3DFEE" w:themeFill="accent1" w:themeFillTint="3F"/>
@@ -10327,7 +10257,6 @@
     <w:tblPr>
       <w:tblStyleRowBandSize w:val="1"/>
       <w:tblStyleColBandSize w:val="1"/>
-      <w:tblInd w:w="0" w:type="dxa"/>
       <w:tblBorders>
         <w:top w:val="single" w:sz="8" w:space="0" w:color="FFFFFF" w:themeColor="background1"/>
         <w:left w:val="single" w:sz="8" w:space="0" w:color="FFFFFF" w:themeColor="background1"/>
@@ -10336,12 +10265,6 @@
         <w:insideH w:val="single" w:sz="6" w:space="0" w:color="FFFFFF" w:themeColor="background1"/>
         <w:insideV w:val="single" w:sz="6" w:space="0" w:color="FFFFFF" w:themeColor="background1"/>
       </w:tblBorders>
-      <w:tblCellMar>
-        <w:top w:w="0" w:type="dxa"/>
-        <w:left w:w="108" w:type="dxa"/>
-        <w:bottom w:w="0" w:type="dxa"/>
-        <w:right w:w="108" w:type="dxa"/>
-      </w:tblCellMar>
     </w:tblPr>
     <w:tcPr>
       <w:shd w:val="clear" w:color="auto" w:fill="EFD3D2" w:themeFill="accent2" w:themeFillTint="3F"/>
@@ -10468,7 +10391,6 @@
     <w:tblPr>
       <w:tblStyleRowBandSize w:val="1"/>
       <w:tblStyleColBandSize w:val="1"/>
-      <w:tblInd w:w="0" w:type="dxa"/>
       <w:tblBorders>
         <w:top w:val="single" w:sz="8" w:space="0" w:color="FFFFFF" w:themeColor="background1"/>
         <w:left w:val="single" w:sz="8" w:space="0" w:color="FFFFFF" w:themeColor="background1"/>
@@ -10477,12 +10399,6 @@
         <w:insideH w:val="single" w:sz="6" w:space="0" w:color="FFFFFF" w:themeColor="background1"/>
         <w:insideV w:val="single" w:sz="6" w:space="0" w:color="FFFFFF" w:themeColor="background1"/>
       </w:tblBorders>
-      <w:tblCellMar>
-        <w:top w:w="0" w:type="dxa"/>
-        <w:left w:w="108" w:type="dxa"/>
-        <w:bottom w:w="0" w:type="dxa"/>
-        <w:right w:w="108" w:type="dxa"/>
-      </w:tblCellMar>
     </w:tblPr>
     <w:tcPr>
       <w:shd w:val="clear" w:color="auto" w:fill="E6EED5" w:themeFill="accent3" w:themeFillTint="3F"/>
@@ -10609,7 +10525,6 @@
     <w:tblPr>
       <w:tblStyleRowBandSize w:val="1"/>
       <w:tblStyleColBandSize w:val="1"/>
-      <w:tblInd w:w="0" w:type="dxa"/>
       <w:tblBorders>
         <w:top w:val="single" w:sz="8" w:space="0" w:color="FFFFFF" w:themeColor="background1"/>
         <w:left w:val="single" w:sz="8" w:space="0" w:color="FFFFFF" w:themeColor="background1"/>
@@ -10618,12 +10533,6 @@
         <w:insideH w:val="single" w:sz="6" w:space="0" w:color="FFFFFF" w:themeColor="background1"/>
         <w:insideV w:val="single" w:sz="6" w:space="0" w:color="FFFFFF" w:themeColor="background1"/>
       </w:tblBorders>
-      <w:tblCellMar>
-        <w:top w:w="0" w:type="dxa"/>
-        <w:left w:w="108" w:type="dxa"/>
-        <w:bottom w:w="0" w:type="dxa"/>
-        <w:right w:w="108" w:type="dxa"/>
-      </w:tblCellMar>
     </w:tblPr>
     <w:tcPr>
       <w:shd w:val="clear" w:color="auto" w:fill="DFD8E8" w:themeFill="accent4" w:themeFillTint="3F"/>
@@ -10750,7 +10659,6 @@
     <w:tblPr>
       <w:tblStyleRowBandSize w:val="1"/>
       <w:tblStyleColBandSize w:val="1"/>
-      <w:tblInd w:w="0" w:type="dxa"/>
       <w:tblBorders>
         <w:top w:val="single" w:sz="8" w:space="0" w:color="FFFFFF" w:themeColor="background1"/>
         <w:left w:val="single" w:sz="8" w:space="0" w:color="FFFFFF" w:themeColor="background1"/>
@@ -10759,12 +10667,6 @@
         <w:insideH w:val="single" w:sz="6" w:space="0" w:color="FFFFFF" w:themeColor="background1"/>
         <w:insideV w:val="single" w:sz="6" w:space="0" w:color="FFFFFF" w:themeColor="background1"/>
       </w:tblBorders>
-      <w:tblCellMar>
-        <w:top w:w="0" w:type="dxa"/>
-        <w:left w:w="108" w:type="dxa"/>
-        <w:bottom w:w="0" w:type="dxa"/>
-        <w:right w:w="108" w:type="dxa"/>
-      </w:tblCellMar>
     </w:tblPr>
     <w:tcPr>
       <w:shd w:val="clear" w:color="auto" w:fill="D2EAF1" w:themeFill="accent5" w:themeFillTint="3F"/>
@@ -10891,7 +10793,6 @@
     <w:tblPr>
       <w:tblStyleRowBandSize w:val="1"/>
       <w:tblStyleColBandSize w:val="1"/>
-      <w:tblInd w:w="0" w:type="dxa"/>
       <w:tblBorders>
         <w:top w:val="single" w:sz="8" w:space="0" w:color="FFFFFF" w:themeColor="background1"/>
         <w:left w:val="single" w:sz="8" w:space="0" w:color="FFFFFF" w:themeColor="background1"/>
@@ -10900,12 +10801,6 @@
         <w:insideH w:val="single" w:sz="6" w:space="0" w:color="FFFFFF" w:themeColor="background1"/>
         <w:insideV w:val="single" w:sz="6" w:space="0" w:color="FFFFFF" w:themeColor="background1"/>
       </w:tblBorders>
-      <w:tblCellMar>
-        <w:top w:w="0" w:type="dxa"/>
-        <w:left w:w="108" w:type="dxa"/>
-        <w:bottom w:w="0" w:type="dxa"/>
-        <w:right w:w="108" w:type="dxa"/>
-      </w:tblCellMar>
     </w:tblPr>
     <w:tcPr>
       <w:shd w:val="clear" w:color="auto" w:fill="FDE4D0" w:themeFill="accent6" w:themeFillTint="3F"/>
@@ -11035,13 +10930,6 @@
     <w:tblPr>
       <w:tblStyleRowBandSize w:val="1"/>
       <w:tblStyleColBandSize w:val="1"/>
-      <w:tblInd w:w="0" w:type="dxa"/>
-      <w:tblCellMar>
-        <w:top w:w="0" w:type="dxa"/>
-        <w:left w:w="108" w:type="dxa"/>
-        <w:bottom w:w="0" w:type="dxa"/>
-        <w:right w:w="108" w:type="dxa"/>
-      </w:tblCellMar>
     </w:tblPr>
     <w:tcPr>
       <w:shd w:val="clear" w:color="auto" w:fill="000000" w:themeFill="text1"/>
@@ -11149,13 +11037,6 @@
     <w:tblPr>
       <w:tblStyleRowBandSize w:val="1"/>
       <w:tblStyleColBandSize w:val="1"/>
-      <w:tblInd w:w="0" w:type="dxa"/>
-      <w:tblCellMar>
-        <w:top w:w="0" w:type="dxa"/>
-        <w:left w:w="108" w:type="dxa"/>
-        <w:bottom w:w="0" w:type="dxa"/>
-        <w:right w:w="108" w:type="dxa"/>
-      </w:tblCellMar>
     </w:tblPr>
     <w:tcPr>
       <w:shd w:val="clear" w:color="auto" w:fill="4F81BD" w:themeFill="accent1"/>
@@ -11263,13 +11144,6 @@
     <w:tblPr>
       <w:tblStyleRowBandSize w:val="1"/>
       <w:tblStyleColBandSize w:val="1"/>
-      <w:tblInd w:w="0" w:type="dxa"/>
-      <w:tblCellMar>
-        <w:top w:w="0" w:type="dxa"/>
-        <w:left w:w="108" w:type="dxa"/>
-        <w:bottom w:w="0" w:type="dxa"/>
-        <w:right w:w="108" w:type="dxa"/>
-      </w:tblCellMar>
     </w:tblPr>
     <w:tcPr>
       <w:shd w:val="clear" w:color="auto" w:fill="C0504D" w:themeFill="accent2"/>
@@ -11377,13 +11251,6 @@
     <w:tblPr>
       <w:tblStyleRowBandSize w:val="1"/>
       <w:tblStyleColBandSize w:val="1"/>
-      <w:tblInd w:w="0" w:type="dxa"/>
-      <w:tblCellMar>
-        <w:top w:w="0" w:type="dxa"/>
-        <w:left w:w="108" w:type="dxa"/>
-        <w:bottom w:w="0" w:type="dxa"/>
-        <w:right w:w="108" w:type="dxa"/>
-      </w:tblCellMar>
     </w:tblPr>
     <w:tcPr>
       <w:shd w:val="clear" w:color="auto" w:fill="9BBB59" w:themeFill="accent3"/>
@@ -11491,13 +11358,6 @@
     <w:tblPr>
       <w:tblStyleRowBandSize w:val="1"/>
       <w:tblStyleColBandSize w:val="1"/>
-      <w:tblInd w:w="0" w:type="dxa"/>
-      <w:tblCellMar>
-        <w:top w:w="0" w:type="dxa"/>
-        <w:left w:w="108" w:type="dxa"/>
-        <w:bottom w:w="0" w:type="dxa"/>
-        <w:right w:w="108" w:type="dxa"/>
-      </w:tblCellMar>
     </w:tblPr>
     <w:tcPr>
       <w:shd w:val="clear" w:color="auto" w:fill="8064A2" w:themeFill="accent4"/>
@@ -11605,13 +11465,6 @@
     <w:tblPr>
       <w:tblStyleRowBandSize w:val="1"/>
       <w:tblStyleColBandSize w:val="1"/>
-      <w:tblInd w:w="0" w:type="dxa"/>
-      <w:tblCellMar>
-        <w:top w:w="0" w:type="dxa"/>
-        <w:left w:w="108" w:type="dxa"/>
-        <w:bottom w:w="0" w:type="dxa"/>
-        <w:right w:w="108" w:type="dxa"/>
-      </w:tblCellMar>
     </w:tblPr>
     <w:tcPr>
       <w:shd w:val="clear" w:color="auto" w:fill="4BACC6" w:themeFill="accent5"/>
@@ -11719,13 +11572,6 @@
     <w:tblPr>
       <w:tblStyleRowBandSize w:val="1"/>
       <w:tblStyleColBandSize w:val="1"/>
-      <w:tblInd w:w="0" w:type="dxa"/>
-      <w:tblCellMar>
-        <w:top w:w="0" w:type="dxa"/>
-        <w:left w:w="108" w:type="dxa"/>
-        <w:bottom w:w="0" w:type="dxa"/>
-        <w:right w:w="108" w:type="dxa"/>
-      </w:tblCellMar>
     </w:tblPr>
     <w:tcPr>
       <w:shd w:val="clear" w:color="auto" w:fill="F79646" w:themeFill="accent6"/>
@@ -11833,7 +11679,6 @@
     <w:tblPr>
       <w:tblStyleRowBandSize w:val="1"/>
       <w:tblStyleColBandSize w:val="1"/>
-      <w:tblInd w:w="0" w:type="dxa"/>
       <w:tblBorders>
         <w:top w:val="single" w:sz="24" w:space="0" w:color="C0504D" w:themeColor="accent2"/>
         <w:left w:val="single" w:sz="4" w:space="0" w:color="000000" w:themeColor="text1"/>
@@ -11842,12 +11687,6 @@
         <w:insideH w:val="single" w:sz="4" w:space="0" w:color="FFFFFF" w:themeColor="background1"/>
         <w:insideV w:val="single" w:sz="4" w:space="0" w:color="FFFFFF" w:themeColor="background1"/>
       </w:tblBorders>
-      <w:tblCellMar>
-        <w:top w:w="0" w:type="dxa"/>
-        <w:left w:w="108" w:type="dxa"/>
-        <w:bottom w:w="0" w:type="dxa"/>
-        <w:right w:w="108" w:type="dxa"/>
-      </w:tblCellMar>
     </w:tblPr>
     <w:tcPr>
       <w:shd w:val="clear" w:color="auto" w:fill="E6E6E6" w:themeFill="text1" w:themeFillTint="19"/>
@@ -11955,7 +11794,6 @@
     <w:tblPr>
       <w:tblStyleRowBandSize w:val="1"/>
       <w:tblStyleColBandSize w:val="1"/>
-      <w:tblInd w:w="0" w:type="dxa"/>
       <w:tblBorders>
         <w:top w:val="single" w:sz="24" w:space="0" w:color="C0504D" w:themeColor="accent2"/>
         <w:left w:val="single" w:sz="4" w:space="0" w:color="4F81BD" w:themeColor="accent1"/>
@@ -11964,12 +11802,6 @@
         <w:insideH w:val="single" w:sz="4" w:space="0" w:color="FFFFFF" w:themeColor="background1"/>
         <w:insideV w:val="single" w:sz="4" w:space="0" w:color="FFFFFF" w:themeColor="background1"/>
       </w:tblBorders>
-      <w:tblCellMar>
-        <w:top w:w="0" w:type="dxa"/>
-        <w:left w:w="108" w:type="dxa"/>
-        <w:bottom w:w="0" w:type="dxa"/>
-        <w:right w:w="108" w:type="dxa"/>
-      </w:tblCellMar>
     </w:tblPr>
     <w:tcPr>
       <w:shd w:val="clear" w:color="auto" w:fill="EDF2F8" w:themeFill="accent1" w:themeFillTint="19"/>
@@ -12077,7 +11909,6 @@
     <w:tblPr>
       <w:tblStyleRowBandSize w:val="1"/>
       <w:tblStyleColBandSize w:val="1"/>
-      <w:tblInd w:w="0" w:type="dxa"/>
       <w:tblBorders>
         <w:top w:val="single" w:sz="24" w:space="0" w:color="C0504D" w:themeColor="accent2"/>
         <w:left w:val="single" w:sz="4" w:space="0" w:color="C0504D" w:themeColor="accent2"/>
@@ -12086,12 +11917,6 @@
         <w:insideH w:val="single" w:sz="4" w:space="0" w:color="FFFFFF" w:themeColor="background1"/>
         <w:insideV w:val="single" w:sz="4" w:space="0" w:color="FFFFFF" w:themeColor="background1"/>
       </w:tblBorders>
-      <w:tblCellMar>
-        <w:top w:w="0" w:type="dxa"/>
-        <w:left w:w="108" w:type="dxa"/>
-        <w:bottom w:w="0" w:type="dxa"/>
-        <w:right w:w="108" w:type="dxa"/>
-      </w:tblCellMar>
     </w:tblPr>
     <w:tcPr>
       <w:shd w:val="clear" w:color="auto" w:fill="F8EDED" w:themeFill="accent2" w:themeFillTint="19"/>
@@ -12199,7 +12024,6 @@
     <w:tblPr>
       <w:tblStyleRowBandSize w:val="1"/>
       <w:tblStyleColBandSize w:val="1"/>
-      <w:tblInd w:w="0" w:type="dxa"/>
       <w:tblBorders>
         <w:top w:val="single" w:sz="24" w:space="0" w:color="8064A2" w:themeColor="accent4"/>
         <w:left w:val="single" w:sz="4" w:space="0" w:color="9BBB59" w:themeColor="accent3"/>
@@ -12208,12 +12032,6 @@
         <w:insideH w:val="single" w:sz="4" w:space="0" w:color="FFFFFF" w:themeColor="background1"/>
         <w:insideV w:val="single" w:sz="4" w:space="0" w:color="FFFFFF" w:themeColor="background1"/>
       </w:tblBorders>
-      <w:tblCellMar>
-        <w:top w:w="0" w:type="dxa"/>
-        <w:left w:w="108" w:type="dxa"/>
-        <w:bottom w:w="0" w:type="dxa"/>
-        <w:right w:w="108" w:type="dxa"/>
-      </w:tblCellMar>
     </w:tblPr>
     <w:tcPr>
       <w:shd w:val="clear" w:color="auto" w:fill="F5F8EE" w:themeFill="accent3" w:themeFillTint="19"/>
@@ -12311,7 +12129,6 @@
     <w:tblPr>
       <w:tblStyleRowBandSize w:val="1"/>
       <w:tblStyleColBandSize w:val="1"/>
-      <w:tblInd w:w="0" w:type="dxa"/>
       <w:tblBorders>
         <w:top w:val="single" w:sz="24" w:space="0" w:color="9BBB59" w:themeColor="accent3"/>
         <w:left w:val="single" w:sz="4" w:space="0" w:color="8064A2" w:themeColor="accent4"/>
@@ -12320,12 +12137,6 @@
         <w:insideH w:val="single" w:sz="4" w:space="0" w:color="FFFFFF" w:themeColor="background1"/>
         <w:insideV w:val="single" w:sz="4" w:space="0" w:color="FFFFFF" w:themeColor="background1"/>
       </w:tblBorders>
-      <w:tblCellMar>
-        <w:top w:w="0" w:type="dxa"/>
-        <w:left w:w="108" w:type="dxa"/>
-        <w:bottom w:w="0" w:type="dxa"/>
-        <w:right w:w="108" w:type="dxa"/>
-      </w:tblCellMar>
     </w:tblPr>
     <w:tcPr>
       <w:shd w:val="clear" w:color="auto" w:fill="F2EFF6" w:themeFill="accent4" w:themeFillTint="19"/>
@@ -12433,7 +12244,6 @@
     <w:tblPr>
       <w:tblStyleRowBandSize w:val="1"/>
       <w:tblStyleColBandSize w:val="1"/>
-      <w:tblInd w:w="0" w:type="dxa"/>
       <w:tblBorders>
         <w:top w:val="single" w:sz="24" w:space="0" w:color="F79646" w:themeColor="accent6"/>
         <w:left w:val="single" w:sz="4" w:space="0" w:color="4BACC6" w:themeColor="accent5"/>
@@ -12442,12 +12252,6 @@
         <w:insideH w:val="single" w:sz="4" w:space="0" w:color="FFFFFF" w:themeColor="background1"/>
         <w:insideV w:val="single" w:sz="4" w:space="0" w:color="FFFFFF" w:themeColor="background1"/>
       </w:tblBorders>
-      <w:tblCellMar>
-        <w:top w:w="0" w:type="dxa"/>
-        <w:left w:w="108" w:type="dxa"/>
-        <w:bottom w:w="0" w:type="dxa"/>
-        <w:right w:w="108" w:type="dxa"/>
-      </w:tblCellMar>
     </w:tblPr>
     <w:tcPr>
       <w:shd w:val="clear" w:color="auto" w:fill="EDF6F9" w:themeFill="accent5" w:themeFillTint="19"/>
@@ -12555,7 +12359,6 @@
     <w:tblPr>
       <w:tblStyleRowBandSize w:val="1"/>
       <w:tblStyleColBandSize w:val="1"/>
-      <w:tblInd w:w="0" w:type="dxa"/>
       <w:tblBorders>
         <w:top w:val="single" w:sz="24" w:space="0" w:color="4BACC6" w:themeColor="accent5"/>
         <w:left w:val="single" w:sz="4" w:space="0" w:color="F79646" w:themeColor="accent6"/>
@@ -12564,12 +12367,6 @@
         <w:insideH w:val="single" w:sz="4" w:space="0" w:color="FFFFFF" w:themeColor="background1"/>
         <w:insideV w:val="single" w:sz="4" w:space="0" w:color="FFFFFF" w:themeColor="background1"/>
       </w:tblBorders>
-      <w:tblCellMar>
-        <w:top w:w="0" w:type="dxa"/>
-        <w:left w:w="108" w:type="dxa"/>
-        <w:bottom w:w="0" w:type="dxa"/>
-        <w:right w:w="108" w:type="dxa"/>
-      </w:tblCellMar>
     </w:tblPr>
     <w:tcPr>
       <w:shd w:val="clear" w:color="auto" w:fill="FEF4EC" w:themeFill="accent6" w:themeFillTint="19"/>
@@ -12677,13 +12474,6 @@
     <w:tblPr>
       <w:tblStyleRowBandSize w:val="1"/>
       <w:tblStyleColBandSize w:val="1"/>
-      <w:tblInd w:w="0" w:type="dxa"/>
-      <w:tblCellMar>
-        <w:top w:w="0" w:type="dxa"/>
-        <w:left w:w="108" w:type="dxa"/>
-        <w:bottom w:w="0" w:type="dxa"/>
-        <w:right w:w="108" w:type="dxa"/>
-      </w:tblCellMar>
     </w:tblPr>
     <w:tcPr>
       <w:shd w:val="clear" w:color="auto" w:fill="E6E6E6" w:themeFill="text1" w:themeFillTint="19"/>
@@ -12763,13 +12553,6 @@
     <w:tblPr>
       <w:tblStyleRowBandSize w:val="1"/>
       <w:tblStyleColBandSize w:val="1"/>
-      <w:tblInd w:w="0" w:type="dxa"/>
-      <w:tblCellMar>
-        <w:top w:w="0" w:type="dxa"/>
-        <w:left w:w="108" w:type="dxa"/>
-        <w:bottom w:w="0" w:type="dxa"/>
-        <w:right w:w="108" w:type="dxa"/>
-      </w:tblCellMar>
     </w:tblPr>
     <w:tcPr>
       <w:shd w:val="clear" w:color="auto" w:fill="EDF2F8" w:themeFill="accent1" w:themeFillTint="19"/>
@@ -12849,13 +12632,6 @@
     <w:tblPr>
       <w:tblStyleRowBandSize w:val="1"/>
       <w:tblStyleColBandSize w:val="1"/>
-      <w:tblInd w:w="0" w:type="dxa"/>
-      <w:tblCellMar>
-        <w:top w:w="0" w:type="dxa"/>
-        <w:left w:w="108" w:type="dxa"/>
-        <w:bottom w:w="0" w:type="dxa"/>
-        <w:right w:w="108" w:type="dxa"/>
-      </w:tblCellMar>
     </w:tblPr>
     <w:tcPr>
       <w:shd w:val="clear" w:color="auto" w:fill="F8EDED" w:themeFill="accent2" w:themeFillTint="19"/>
@@ -12935,13 +12711,6 @@
     <w:tblPr>
       <w:tblStyleRowBandSize w:val="1"/>
       <w:tblStyleColBandSize w:val="1"/>
-      <w:tblInd w:w="0" w:type="dxa"/>
-      <w:tblCellMar>
-        <w:top w:w="0" w:type="dxa"/>
-        <w:left w:w="108" w:type="dxa"/>
-        <w:bottom w:w="0" w:type="dxa"/>
-        <w:right w:w="108" w:type="dxa"/>
-      </w:tblCellMar>
     </w:tblPr>
     <w:tcPr>
       <w:shd w:val="clear" w:color="auto" w:fill="F5F8EE" w:themeFill="accent3" w:themeFillTint="19"/>
@@ -13021,13 +12790,6 @@
     <w:tblPr>
       <w:tblStyleRowBandSize w:val="1"/>
       <w:tblStyleColBandSize w:val="1"/>
-      <w:tblInd w:w="0" w:type="dxa"/>
-      <w:tblCellMar>
-        <w:top w:w="0" w:type="dxa"/>
-        <w:left w:w="108" w:type="dxa"/>
-        <w:bottom w:w="0" w:type="dxa"/>
-        <w:right w:w="108" w:type="dxa"/>
-      </w:tblCellMar>
     </w:tblPr>
     <w:tcPr>
       <w:shd w:val="clear" w:color="auto" w:fill="F2EFF6" w:themeFill="accent4" w:themeFillTint="19"/>
@@ -13107,13 +12869,6 @@
     <w:tblPr>
       <w:tblStyleRowBandSize w:val="1"/>
       <w:tblStyleColBandSize w:val="1"/>
-      <w:tblInd w:w="0" w:type="dxa"/>
-      <w:tblCellMar>
-        <w:top w:w="0" w:type="dxa"/>
-        <w:left w:w="108" w:type="dxa"/>
-        <w:bottom w:w="0" w:type="dxa"/>
-        <w:right w:w="108" w:type="dxa"/>
-      </w:tblCellMar>
     </w:tblPr>
     <w:tcPr>
       <w:shd w:val="clear" w:color="auto" w:fill="EDF6F9" w:themeFill="accent5" w:themeFillTint="19"/>
@@ -13193,13 +12948,6 @@
     <w:tblPr>
       <w:tblStyleRowBandSize w:val="1"/>
       <w:tblStyleColBandSize w:val="1"/>
-      <w:tblInd w:w="0" w:type="dxa"/>
-      <w:tblCellMar>
-        <w:top w:w="0" w:type="dxa"/>
-        <w:left w:w="108" w:type="dxa"/>
-        <w:bottom w:w="0" w:type="dxa"/>
-        <w:right w:w="108" w:type="dxa"/>
-      </w:tblCellMar>
     </w:tblPr>
     <w:tcPr>
       <w:shd w:val="clear" w:color="auto" w:fill="FEF4EC" w:themeFill="accent6" w:themeFillTint="19"/>
@@ -13279,16 +13027,9 @@
     <w:tblPr>
       <w:tblStyleRowBandSize w:val="1"/>
       <w:tblStyleColBandSize w:val="1"/>
-      <w:tblInd w:w="0" w:type="dxa"/>
       <w:tblBorders>
         <w:insideH w:val="single" w:sz="4" w:space="0" w:color="FFFFFF" w:themeColor="background1"/>
       </w:tblBorders>
-      <w:tblCellMar>
-        <w:top w:w="0" w:type="dxa"/>
-        <w:left w:w="108" w:type="dxa"/>
-        <w:bottom w:w="0" w:type="dxa"/>
-        <w:right w:w="108" w:type="dxa"/>
-      </w:tblCellMar>
     </w:tblPr>
     <w:tcPr>
       <w:shd w:val="clear" w:color="auto" w:fill="CCCCCC" w:themeFill="text1" w:themeFillTint="33"/>
@@ -13359,16 +13100,9 @@
     <w:tblPr>
       <w:tblStyleRowBandSize w:val="1"/>
       <w:tblStyleColBandSize w:val="1"/>
-      <w:tblInd w:w="0" w:type="dxa"/>
       <w:tblBorders>
         <w:insideH w:val="single" w:sz="4" w:space="0" w:color="FFFFFF" w:themeColor="background1"/>
       </w:tblBorders>
-      <w:tblCellMar>
-        <w:top w:w="0" w:type="dxa"/>
-        <w:left w:w="108" w:type="dxa"/>
-        <w:bottom w:w="0" w:type="dxa"/>
-        <w:right w:w="108" w:type="dxa"/>
-      </w:tblCellMar>
     </w:tblPr>
     <w:tcPr>
       <w:shd w:val="clear" w:color="auto" w:fill="DBE5F1" w:themeFill="accent1" w:themeFillTint="33"/>
@@ -13439,16 +13173,9 @@
     <w:tblPr>
       <w:tblStyleRowBandSize w:val="1"/>
       <w:tblStyleColBandSize w:val="1"/>
-      <w:tblInd w:w="0" w:type="dxa"/>
       <w:tblBorders>
         <w:insideH w:val="single" w:sz="4" w:space="0" w:color="FFFFFF" w:themeColor="background1"/>
       </w:tblBorders>
-      <w:tblCellMar>
-        <w:top w:w="0" w:type="dxa"/>
-        <w:left w:w="108" w:type="dxa"/>
-        <w:bottom w:w="0" w:type="dxa"/>
-        <w:right w:w="108" w:type="dxa"/>
-      </w:tblCellMar>
     </w:tblPr>
     <w:tcPr>
       <w:shd w:val="clear" w:color="auto" w:fill="F2DBDB" w:themeFill="accent2" w:themeFillTint="33"/>
@@ -13519,16 +13246,9 @@
     <w:tblPr>
       <w:tblStyleRowBandSize w:val="1"/>
       <w:tblStyleColBandSize w:val="1"/>
-      <w:tblInd w:w="0" w:type="dxa"/>
       <w:tblBorders>
         <w:insideH w:val="single" w:sz="4" w:space="0" w:color="FFFFFF" w:themeColor="background1"/>
       </w:tblBorders>
-      <w:tblCellMar>
-        <w:top w:w="0" w:type="dxa"/>
-        <w:left w:w="108" w:type="dxa"/>
-        <w:bottom w:w="0" w:type="dxa"/>
-        <w:right w:w="108" w:type="dxa"/>
-      </w:tblCellMar>
     </w:tblPr>
     <w:tcPr>
       <w:shd w:val="clear" w:color="auto" w:fill="EAF1DD" w:themeFill="accent3" w:themeFillTint="33"/>
@@ -13599,16 +13319,9 @@
     <w:tblPr>
       <w:tblStyleRowBandSize w:val="1"/>
       <w:tblStyleColBandSize w:val="1"/>
-      <w:tblInd w:w="0" w:type="dxa"/>
       <w:tblBorders>
         <w:insideH w:val="single" w:sz="4" w:space="0" w:color="FFFFFF" w:themeColor="background1"/>
       </w:tblBorders>
-      <w:tblCellMar>
-        <w:top w:w="0" w:type="dxa"/>
-        <w:left w:w="108" w:type="dxa"/>
-        <w:bottom w:w="0" w:type="dxa"/>
-        <w:right w:w="108" w:type="dxa"/>
-      </w:tblCellMar>
     </w:tblPr>
     <w:tcPr>
       <w:shd w:val="clear" w:color="auto" w:fill="E5DFEC" w:themeFill="accent4" w:themeFillTint="33"/>
@@ -13679,16 +13392,9 @@
     <w:tblPr>
       <w:tblStyleRowBandSize w:val="1"/>
       <w:tblStyleColBandSize w:val="1"/>
-      <w:tblInd w:w="0" w:type="dxa"/>
       <w:tblBorders>
         <w:insideH w:val="single" w:sz="4" w:space="0" w:color="FFFFFF" w:themeColor="background1"/>
       </w:tblBorders>
-      <w:tblCellMar>
-        <w:top w:w="0" w:type="dxa"/>
-        <w:left w:w="108" w:type="dxa"/>
-        <w:bottom w:w="0" w:type="dxa"/>
-        <w:right w:w="108" w:type="dxa"/>
-      </w:tblCellMar>
     </w:tblPr>
     <w:tcPr>
       <w:shd w:val="clear" w:color="auto" w:fill="DAEEF3" w:themeFill="accent5" w:themeFillTint="33"/>
@@ -13759,16 +13465,9 @@
     <w:tblPr>
       <w:tblStyleRowBandSize w:val="1"/>
       <w:tblStyleColBandSize w:val="1"/>
-      <w:tblInd w:w="0" w:type="dxa"/>
       <w:tblBorders>
         <w:insideH w:val="single" w:sz="4" w:space="0" w:color="FFFFFF" w:themeColor="background1"/>
       </w:tblBorders>
-      <w:tblCellMar>
-        <w:top w:w="0" w:type="dxa"/>
-        <w:left w:w="108" w:type="dxa"/>
-        <w:bottom w:w="0" w:type="dxa"/>
-        <w:right w:w="108" w:type="dxa"/>
-      </w:tblCellMar>
     </w:tblPr>
     <w:tcPr>
       <w:shd w:val="clear" w:color="auto" w:fill="FDE9D9" w:themeFill="accent6" w:themeFillTint="33"/>

</xml_diff>